<commit_message>
Refresh: lab2 gitlab itmo
</commit_message>
<xml_diff>
--- a/informatic/lab2/report.docx
+++ b/informatic/lab2/report.docx
@@ -476,7 +476,7 @@
             </w:rPr>
             <w:fldChar w:fldCharType="separate"/>
           </w:r>
-          <w:hyperlink w:anchor="_Toc241345076" w:history="1">
+          <w:hyperlink w:anchor="_Toc241646969" w:history="1">
             <w:r>
               <w:rPr>
                 <w:rStyle w:val="ac"/>
@@ -504,7 +504,7 @@
                 <w:noProof/>
                 <w:webHidden/>
               </w:rPr>
-              <w:instrText xml:space="preserve"> PAGEREF _Toc241345076 \h </w:instrText>
+              <w:instrText xml:space="preserve"> PAGEREF _Toc241646969 \h </w:instrText>
             </w:r>
             <w:r>
               <w:rPr>
@@ -547,7 +547,7 @@
               <w:lang w:eastAsia="ru-RU"/>
             </w:rPr>
           </w:pPr>
-          <w:hyperlink w:anchor="_Toc241345077" w:history="1">
+          <w:hyperlink w:anchor="_Toc241646970" w:history="1">
             <w:r>
               <w:rPr>
                 <w:rStyle w:val="ac"/>
@@ -575,7 +575,7 @@
                 <w:noProof/>
                 <w:webHidden/>
               </w:rPr>
-              <w:instrText xml:space="preserve"> PAGEREF _Toc241345077 \h </w:instrText>
+              <w:instrText xml:space="preserve"> PAGEREF _Toc241646970 \h </w:instrText>
             </w:r>
             <w:r>
               <w:rPr>
@@ -618,7 +618,7 @@
               <w:lang w:eastAsia="ru-RU"/>
             </w:rPr>
           </w:pPr>
-          <w:hyperlink w:anchor="_Toc241345078" w:history="1">
+          <w:hyperlink w:anchor="_Toc241646971" w:history="1">
             <w:r>
               <w:rPr>
                 <w:rStyle w:val="ac"/>
@@ -646,7 +646,7 @@
                 <w:noProof/>
                 <w:webHidden/>
               </w:rPr>
-              <w:instrText xml:space="preserve"> PAGEREF _Toc241345078 \h </w:instrText>
+              <w:instrText xml:space="preserve"> PAGEREF _Toc241646971 \h </w:instrText>
             </w:r>
             <w:r>
               <w:rPr>
@@ -689,7 +689,7 @@
               <w:lang w:eastAsia="ru-RU"/>
             </w:rPr>
           </w:pPr>
-          <w:hyperlink w:anchor="_Toc241345079" w:history="1">
+          <w:hyperlink w:anchor="_Toc241646972" w:history="1">
             <w:r>
               <w:rPr>
                 <w:rStyle w:val="ac"/>
@@ -717,7 +717,7 @@
                 <w:noProof/>
                 <w:webHidden/>
               </w:rPr>
-              <w:instrText xml:space="preserve"> PAGEREF _Toc241345079 \h </w:instrText>
+              <w:instrText xml:space="preserve"> PAGEREF _Toc241646972 \h </w:instrText>
             </w:r>
             <w:r>
               <w:rPr>
@@ -760,7 +760,7 @@
               <w:lang w:eastAsia="ru-RU"/>
             </w:rPr>
           </w:pPr>
-          <w:hyperlink w:anchor="_Toc241345080" w:history="1">
+          <w:hyperlink w:anchor="_Toc241646973" w:history="1">
             <w:r>
               <w:rPr>
                 <w:rStyle w:val="ac"/>
@@ -788,7 +788,7 @@
                 <w:noProof/>
                 <w:webHidden/>
               </w:rPr>
-              <w:instrText xml:space="preserve"> PAGEREF _Toc241345080 \h </w:instrText>
+              <w:instrText xml:space="preserve"> PAGEREF _Toc241646973 \h </w:instrText>
             </w:r>
             <w:r>
               <w:rPr>
@@ -831,7 +831,7 @@
               <w:lang w:eastAsia="ru-RU"/>
             </w:rPr>
           </w:pPr>
-          <w:hyperlink w:anchor="_Toc241345081" w:history="1">
+          <w:hyperlink w:anchor="_Toc241646974" w:history="1">
             <w:r>
               <w:rPr>
                 <w:rStyle w:val="ac"/>
@@ -859,7 +859,7 @@
                 <w:noProof/>
                 <w:webHidden/>
               </w:rPr>
-              <w:instrText xml:space="preserve"> PAGEREF _Toc241345081 \h </w:instrText>
+              <w:instrText xml:space="preserve"> PAGEREF _Toc241646974 \h </w:instrText>
             </w:r>
             <w:r>
               <w:rPr>
@@ -902,7 +902,7 @@
               <w:lang w:eastAsia="ru-RU"/>
             </w:rPr>
           </w:pPr>
-          <w:hyperlink w:anchor="_Toc241345082" w:history="1">
+          <w:hyperlink w:anchor="_Toc241646975" w:history="1">
             <w:r>
               <w:rPr>
                 <w:rStyle w:val="ac"/>
@@ -930,7 +930,7 @@
                 <w:noProof/>
                 <w:webHidden/>
               </w:rPr>
-              <w:instrText xml:space="preserve"> PAGEREF _Toc241345082 \h </w:instrText>
+              <w:instrText xml:space="preserve"> PAGEREF _Toc241646975 \h </w:instrText>
             </w:r>
             <w:r>
               <w:rPr>
@@ -973,7 +973,7 @@
               <w:lang w:eastAsia="ru-RU"/>
             </w:rPr>
           </w:pPr>
-          <w:hyperlink w:anchor="_Toc241345083" w:history="1">
+          <w:hyperlink w:anchor="_Toc241646976" w:history="1">
             <w:r>
               <w:rPr>
                 <w:rStyle w:val="ac"/>
@@ -1001,7 +1001,7 @@
                 <w:noProof/>
                 <w:webHidden/>
               </w:rPr>
-              <w:instrText xml:space="preserve"> PAGEREF _Toc241345083 \h </w:instrText>
+              <w:instrText xml:space="preserve"> PAGEREF _Toc241646976 \h </w:instrText>
             </w:r>
             <w:r>
               <w:rPr>
@@ -1044,7 +1044,7 @@
               <w:lang w:eastAsia="ru-RU"/>
             </w:rPr>
           </w:pPr>
-          <w:hyperlink w:anchor="_Toc241345084" w:history="1">
+          <w:hyperlink w:anchor="_Toc241646977" w:history="1">
             <w:r>
               <w:rPr>
                 <w:rStyle w:val="ac"/>
@@ -1072,7 +1072,7 @@
                 <w:noProof/>
                 <w:webHidden/>
               </w:rPr>
-              <w:instrText xml:space="preserve"> PAGEREF _Toc241345084 \h </w:instrText>
+              <w:instrText xml:space="preserve"> PAGEREF _Toc241646977 \h </w:instrText>
             </w:r>
             <w:r>
               <w:rPr>
@@ -1115,7 +1115,7 @@
               <w:lang w:eastAsia="ru-RU"/>
             </w:rPr>
           </w:pPr>
-          <w:hyperlink w:anchor="_Toc241345085" w:history="1">
+          <w:hyperlink w:anchor="_Toc241646978" w:history="1">
             <w:r>
               <w:rPr>
                 <w:rStyle w:val="ac"/>
@@ -1143,7 +1143,7 @@
                 <w:noProof/>
                 <w:webHidden/>
               </w:rPr>
-              <w:instrText xml:space="preserve"> PAGEREF _Toc241345085 \h </w:instrText>
+              <w:instrText xml:space="preserve"> PAGEREF _Toc241646978 \h </w:instrText>
             </w:r>
             <w:r>
               <w:rPr>
@@ -1186,7 +1186,7 @@
               <w:lang w:eastAsia="ru-RU"/>
             </w:rPr>
           </w:pPr>
-          <w:hyperlink w:anchor="_Toc241345086" w:history="1">
+          <w:hyperlink w:anchor="_Toc241646979" w:history="1">
             <w:r>
               <w:rPr>
                 <w:rStyle w:val="ac"/>
@@ -1214,7 +1214,7 @@
                 <w:noProof/>
                 <w:webHidden/>
               </w:rPr>
-              <w:instrText xml:space="preserve"> PAGEREF _Toc241345086 \h </w:instrText>
+              <w:instrText xml:space="preserve"> PAGEREF _Toc241646979 \h </w:instrText>
             </w:r>
             <w:r>
               <w:rPr>
@@ -1357,7 +1357,7 @@
           <w:color w:val="000000" w:themeColor="text1"/>
         </w:rPr>
       </w:pPr>
-      <w:bookmarkStart w:id="0" w:name="_Toc241345076"/>
+      <w:bookmarkStart w:id="0" w:name="_Toc241646969"/>
       <w:r>
         <w:rPr>
           <w:rFonts w:ascii="Times New Roman" w:hAnsi="Times New Roman" w:cs="Times New Roman"/>
@@ -1501,7 +1501,7 @@
           <w:color w:val="000000" w:themeColor="text1"/>
         </w:rPr>
       </w:pPr>
-      <w:bookmarkStart w:id="1" w:name="_Toc241345077"/>
+      <w:bookmarkStart w:id="1" w:name="_Toc241646970"/>
       <w:r>
         <w:rPr>
           <w:rFonts w:ascii="Times New Roman" w:hAnsi="Times New Roman" w:cs="Times New Roman"/>
@@ -1520,7 +1520,7 @@
           <w:color w:val="000000" w:themeColor="text1"/>
         </w:rPr>
       </w:pPr>
-      <w:bookmarkStart w:id="2" w:name="_Toc241345078"/>
+      <w:bookmarkStart w:id="2" w:name="_Toc241646971"/>
       <w:r>
         <w:rPr>
           <w:rFonts w:ascii="Times New Roman" w:hAnsi="Times New Roman" w:cs="Times New Roman"/>
@@ -1606,6 +1606,7 @@
       <w:r>
         <w:rPr>
           <w:rFonts w:ascii="Times New Roman" w:hAnsi="Times New Roman" w:cs="Times New Roman"/>
+          <w:noProof/>
           <w:color w:val="000000" w:themeColor="text1"/>
         </w:rPr>
         <w:drawing>
@@ -1686,14 +1687,7 @@
           <w:rFonts w:ascii="Times New Roman" w:hAnsi="Times New Roman" w:cs="Times New Roman"/>
           <w:color w:val="000000" w:themeColor="text1"/>
         </w:rPr>
-        <w:t xml:space="preserve">хема декодирования классического кода </w:t>
-      </w:r>
-      <w:r>
-        <w:rPr>
-          <w:rFonts w:ascii="Times New Roman" w:hAnsi="Times New Roman" w:cs="Times New Roman"/>
-          <w:color w:val="000000" w:themeColor="text1"/>
-        </w:rPr>
-        <w:t>Хэмминга</w:t>
+        <w:t>хема декодирования классического кода Хэмминга</w:t>
       </w:r>
       <w:r>
         <w:rPr>
@@ -2440,6 +2434,7 @@
         </w:rPr>
         <w:t xml:space="preserve"> </w:t>
       </w:r>
+      <w:proofErr w:type="spellStart"/>
       <w:r>
         <w:rPr>
           <w:rFonts w:ascii="Times New Roman" w:hAnsi="Times New Roman" w:cs="Times New Roman"/>
@@ -2448,6 +2443,7 @@
         </w:rPr>
         <w:t>i</w:t>
       </w:r>
+      <w:proofErr w:type="spellEnd"/>
       <w:r>
         <w:rPr>
           <w:rFonts w:ascii="Times New Roman" w:hAnsi="Times New Roman" w:cs="Times New Roman"/>
@@ -2508,7 +2504,7 @@
           <w:color w:val="000000" w:themeColor="text1"/>
         </w:rPr>
       </w:pPr>
-      <w:bookmarkStart w:id="3" w:name="_Toc241345079"/>
+      <w:bookmarkStart w:id="3" w:name="_Toc241646972"/>
       <w:r>
         <w:rPr>
           <w:rFonts w:ascii="Times New Roman" w:hAnsi="Times New Roman" w:cs="Times New Roman"/>
@@ -2565,14 +2561,7 @@
           <w:rFonts w:ascii="Times New Roman" w:hAnsi="Times New Roman" w:cs="Times New Roman"/>
           <w:color w:val="000000" w:themeColor="text1"/>
         </w:rPr>
-        <w:t xml:space="preserve"> для сообщения </w:t>
-      </w:r>
-      <w:r>
-        <w:rPr>
-          <w:rFonts w:ascii="Times New Roman" w:hAnsi="Times New Roman" w:cs="Times New Roman"/>
-          <w:color w:val="000000" w:themeColor="text1"/>
-        </w:rPr>
-        <w:t>1101011</w:t>
+        <w:t xml:space="preserve"> для сообщения 1101011</w:t>
       </w:r>
     </w:p>
     <w:p>
@@ -2594,6 +2583,7 @@
       <w:r>
         <w:rPr>
           <w:rFonts w:ascii="Times New Roman" w:hAnsi="Times New Roman" w:cs="Times New Roman"/>
+          <w:noProof/>
           <w:color w:val="000000" w:themeColor="text1"/>
         </w:rPr>
         <w:drawing>
@@ -2646,21 +2636,7 @@
           <w:rFonts w:ascii="Times New Roman" w:hAnsi="Times New Roman" w:cs="Times New Roman"/>
           <w:color w:val="000000" w:themeColor="text1"/>
         </w:rPr>
-        <w:t xml:space="preserve">Рисунок </w:t>
-      </w:r>
-      <w:r>
-        <w:rPr>
-          <w:rFonts w:ascii="Times New Roman" w:hAnsi="Times New Roman" w:cs="Times New Roman"/>
-          <w:color w:val="000000" w:themeColor="text1"/>
-        </w:rPr>
-        <w:t>2</w:t>
-      </w:r>
-      <w:r>
-        <w:rPr>
-          <w:rFonts w:ascii="Times New Roman" w:hAnsi="Times New Roman" w:cs="Times New Roman"/>
-          <w:color w:val="000000" w:themeColor="text1"/>
-        </w:rPr>
-        <w:t xml:space="preserve"> </w:t>
+        <w:t xml:space="preserve">Рисунок 2 </w:t>
       </w:r>
       <w:r>
         <w:rPr>
@@ -3394,6 +3370,7 @@
         </w:rPr>
         <w:t xml:space="preserve">1), то есть в (1, 1, 0) =&gt; 6 бит, то есть </w:t>
       </w:r>
+      <w:proofErr w:type="spellStart"/>
       <w:r>
         <w:rPr>
           <w:rFonts w:ascii="Times New Roman" w:hAnsi="Times New Roman" w:cs="Times New Roman"/>
@@ -3402,6 +3379,7 @@
         </w:rPr>
         <w:t>i</w:t>
       </w:r>
+      <w:proofErr w:type="spellEnd"/>
       <w:r>
         <w:rPr>
           <w:rFonts w:ascii="Times New Roman" w:hAnsi="Times New Roman" w:cs="Times New Roman"/>
@@ -3442,7 +3420,7 @@
           <w:color w:val="000000" w:themeColor="text1"/>
         </w:rPr>
       </w:pPr>
-      <w:bookmarkStart w:id="4" w:name="_Toc241345080"/>
+      <w:bookmarkStart w:id="4" w:name="_Toc241646973"/>
       <w:r>
         <w:rPr>
           <w:rFonts w:ascii="Times New Roman" w:hAnsi="Times New Roman" w:cs="Times New Roman"/>
@@ -3499,14 +3477,7 @@
           <w:rFonts w:ascii="Times New Roman" w:hAnsi="Times New Roman" w:cs="Times New Roman"/>
           <w:color w:val="000000" w:themeColor="text1"/>
         </w:rPr>
-        <w:t xml:space="preserve"> для сообщения </w:t>
-      </w:r>
-      <w:r>
-        <w:rPr>
-          <w:rFonts w:ascii="Times New Roman" w:hAnsi="Times New Roman" w:cs="Times New Roman"/>
-          <w:color w:val="000000" w:themeColor="text1"/>
-        </w:rPr>
-        <w:t>1100101</w:t>
+        <w:t xml:space="preserve"> для сообщения 1100101</w:t>
       </w:r>
     </w:p>
     <w:p>
@@ -3528,6 +3499,7 @@
       <w:r>
         <w:rPr>
           <w:rFonts w:ascii="Times New Roman" w:eastAsia="Times New Roman" w:hAnsi="Times New Roman" w:cs="Times New Roman"/>
+          <w:noProof/>
           <w:color w:val="000000" w:themeColor="text1"/>
           <w:kern w:val="0"/>
           <w:sz w:val="22"/>
@@ -3585,21 +3557,7 @@
           <w:rFonts w:ascii="Times New Roman" w:hAnsi="Times New Roman" w:cs="Times New Roman"/>
           <w:color w:val="000000" w:themeColor="text1"/>
         </w:rPr>
-        <w:t xml:space="preserve">Рисунок </w:t>
-      </w:r>
-      <w:r>
-        <w:rPr>
-          <w:rFonts w:ascii="Times New Roman" w:hAnsi="Times New Roman" w:cs="Times New Roman"/>
-          <w:color w:val="000000" w:themeColor="text1"/>
-        </w:rPr>
-        <w:t>3</w:t>
-      </w:r>
-      <w:r>
-        <w:rPr>
-          <w:rFonts w:ascii="Times New Roman" w:hAnsi="Times New Roman" w:cs="Times New Roman"/>
-          <w:color w:val="000000" w:themeColor="text1"/>
-        </w:rPr>
-        <w:t xml:space="preserve"> </w:t>
+        <w:t xml:space="preserve">Рисунок 3 </w:t>
       </w:r>
       <w:r>
         <w:rPr>
@@ -4423,7 +4381,7 @@
           <w:color w:val="000000" w:themeColor="text1"/>
         </w:rPr>
       </w:pPr>
-      <w:bookmarkStart w:id="5" w:name="_Toc241345081"/>
+      <w:bookmarkStart w:id="5" w:name="_Toc241646974"/>
       <w:r>
         <w:rPr>
           <w:rFonts w:ascii="Times New Roman" w:hAnsi="Times New Roman" w:cs="Times New Roman"/>
@@ -4516,6 +4474,7 @@
       <w:r>
         <w:rPr>
           <w:rFonts w:ascii="Times New Roman" w:hAnsi="Times New Roman" w:cs="Times New Roman"/>
+          <w:noProof/>
           <w:color w:val="000000" w:themeColor="text1"/>
         </w:rPr>
         <w:drawing>
@@ -4568,21 +4527,7 @@
           <w:rFonts w:ascii="Times New Roman" w:hAnsi="Times New Roman" w:cs="Times New Roman"/>
           <w:color w:val="000000" w:themeColor="text1"/>
         </w:rPr>
-        <w:t xml:space="preserve">Рисунок </w:t>
-      </w:r>
-      <w:r>
-        <w:rPr>
-          <w:rFonts w:ascii="Times New Roman" w:hAnsi="Times New Roman" w:cs="Times New Roman"/>
-          <w:color w:val="000000" w:themeColor="text1"/>
-        </w:rPr>
-        <w:t>4</w:t>
-      </w:r>
-      <w:r>
-        <w:rPr>
-          <w:rFonts w:ascii="Times New Roman" w:hAnsi="Times New Roman" w:cs="Times New Roman"/>
-          <w:color w:val="000000" w:themeColor="text1"/>
-        </w:rPr>
-        <w:t xml:space="preserve"> </w:t>
+        <w:t xml:space="preserve">Рисунок 4 </w:t>
       </w:r>
       <w:r>
         <w:rPr>
@@ -5303,6 +5248,7 @@
         </w:rPr>
         <w:t xml:space="preserve">1), то есть в (1, 1, 0) =&gt; 6 бит, то есть </w:t>
       </w:r>
+      <w:proofErr w:type="spellStart"/>
       <w:r>
         <w:rPr>
           <w:rFonts w:ascii="Times New Roman" w:hAnsi="Times New Roman" w:cs="Times New Roman"/>
@@ -5311,6 +5257,7 @@
         </w:rPr>
         <w:t>i</w:t>
       </w:r>
+      <w:proofErr w:type="spellEnd"/>
       <w:r>
         <w:rPr>
           <w:rFonts w:ascii="Times New Roman" w:hAnsi="Times New Roman" w:cs="Times New Roman"/>
@@ -5364,7 +5311,7 @@
           <w:color w:val="000000" w:themeColor="text1"/>
         </w:rPr>
       </w:pPr>
-      <w:bookmarkStart w:id="6" w:name="_Toc241345082"/>
+      <w:bookmarkStart w:id="6" w:name="_Toc241646975"/>
       <w:r>
         <w:rPr>
           <w:rFonts w:ascii="Times New Roman" w:hAnsi="Times New Roman" w:cs="Times New Roman"/>
@@ -5450,6 +5397,7 @@
       <w:r>
         <w:rPr>
           <w:rFonts w:ascii="Times New Roman" w:hAnsi="Times New Roman" w:cs="Times New Roman"/>
+          <w:noProof/>
           <w:color w:val="000000" w:themeColor="text1"/>
         </w:rPr>
         <w:drawing>
@@ -5502,21 +5450,7 @@
           <w:rFonts w:ascii="Times New Roman" w:hAnsi="Times New Roman" w:cs="Times New Roman"/>
           <w:color w:val="000000" w:themeColor="text1"/>
         </w:rPr>
-        <w:t xml:space="preserve">Рисунок </w:t>
-      </w:r>
-      <w:r>
-        <w:rPr>
-          <w:rFonts w:ascii="Times New Roman" w:hAnsi="Times New Roman" w:cs="Times New Roman"/>
-          <w:color w:val="000000" w:themeColor="text1"/>
-        </w:rPr>
-        <w:t>5</w:t>
-      </w:r>
-      <w:r>
-        <w:rPr>
-          <w:rFonts w:ascii="Times New Roman" w:hAnsi="Times New Roman" w:cs="Times New Roman"/>
-          <w:color w:val="000000" w:themeColor="text1"/>
-        </w:rPr>
-        <w:t xml:space="preserve"> </w:t>
+        <w:t xml:space="preserve">Рисунок 5 </w:t>
       </w:r>
       <w:r>
         <w:rPr>
@@ -7253,6 +7187,7 @@
         </w:rPr>
         <w:t xml:space="preserve">1), то есть в (1, 1, 1, 0) =&gt; 14 бит, то есть </w:t>
       </w:r>
+      <w:proofErr w:type="spellStart"/>
       <w:r>
         <w:rPr>
           <w:rFonts w:ascii="Times New Roman" w:hAnsi="Times New Roman" w:cs="Times New Roman"/>
@@ -7261,6 +7196,7 @@
         </w:rPr>
         <w:t>i</w:t>
       </w:r>
+      <w:proofErr w:type="spellEnd"/>
       <w:r>
         <w:rPr>
           <w:rFonts w:ascii="Times New Roman" w:hAnsi="Times New Roman" w:cs="Times New Roman"/>
@@ -7314,7 +7250,7 @@
           <w:color w:val="000000" w:themeColor="text1"/>
         </w:rPr>
       </w:pPr>
-      <w:bookmarkStart w:id="7" w:name="_Toc241345083"/>
+      <w:bookmarkStart w:id="7" w:name="_Toc241646976"/>
       <w:r>
         <w:rPr>
           <w:rFonts w:ascii="Times New Roman" w:hAnsi="Times New Roman" w:cs="Times New Roman"/>
@@ -7353,6 +7289,7 @@
         </w:rPr>
         <w:t xml:space="preserve">То есть </w:t>
       </w:r>
+      <w:proofErr w:type="spellStart"/>
       <w:r>
         <w:rPr>
           <w:rFonts w:ascii="Times New Roman" w:hAnsi="Times New Roman" w:cs="Times New Roman"/>
@@ -7361,6 +7298,7 @@
         </w:rPr>
         <w:t>i</w:t>
       </w:r>
+      <w:proofErr w:type="spellEnd"/>
       <w:r>
         <w:rPr>
           <w:rFonts w:ascii="Times New Roman" w:hAnsi="Times New Roman" w:cs="Times New Roman"/>
@@ -7478,6 +7416,7 @@
         </w:rPr>
         <w:t xml:space="preserve"> + </w:t>
       </w:r>
+      <w:proofErr w:type="spellStart"/>
       <w:r>
         <w:rPr>
           <w:rFonts w:ascii="Times New Roman" w:hAnsi="Times New Roman" w:cs="Times New Roman"/>
@@ -7486,6 +7425,7 @@
         </w:rPr>
         <w:t>i</w:t>
       </w:r>
+      <w:proofErr w:type="spellEnd"/>
       <w:r>
         <w:rPr>
           <w:rFonts w:ascii="Times New Roman" w:hAnsi="Times New Roman" w:cs="Times New Roman"/>
@@ -7820,7 +7760,7 @@
           <w:color w:val="000000" w:themeColor="text1"/>
         </w:rPr>
       </w:pPr>
-      <w:bookmarkStart w:id="8" w:name="_Toc241345084"/>
+      <w:bookmarkStart w:id="8" w:name="_Toc241646977"/>
       <w:r>
         <w:rPr>
           <w:rFonts w:ascii="Times New Roman" w:hAnsi="Times New Roman" w:cs="Times New Roman"/>
@@ -7833,8 +7773,7 @@
     <w:p>
       <w:pPr>
         <w:rPr>
-          <w:rFonts w:ascii="Times New Roman" w:hAnsi="Times New Roman" w:cs="Times New Roman"/>
-          <w:color w:val="000000" w:themeColor="text1"/>
+          <w:lang w:val="en-US"/>
         </w:rPr>
       </w:pPr>
       <w:hyperlink r:id="rId15" w:history="1">
@@ -7851,212 +7790,449 @@
     <w:p>
       <w:pPr>
         <w:rPr>
-          <w:rFonts w:ascii="Times New Roman" w:hAnsi="Times New Roman" w:cs="Times New Roman"/>
-          <w:color w:val="000000" w:themeColor="text1"/>
-        </w:rPr>
-      </w:pPr>
-      <w:hyperlink r:id="rId16" w:history="1">
-        <w:r>
-          <w:rPr>
-            <w:rStyle w:val="ac"/>
-            <w:rFonts w:ascii="Times New Roman" w:hAnsi="Times New Roman" w:cs="Times New Roman"/>
-            <w:color w:val="000000" w:themeColor="text1"/>
-            <w:lang w:val="en-US"/>
-          </w:rPr>
-          <w:t>https</w:t>
-        </w:r>
-        <w:r>
-          <w:rPr>
-            <w:rStyle w:val="ac"/>
-            <w:rFonts w:ascii="Times New Roman" w:hAnsi="Times New Roman" w:cs="Times New Roman"/>
-            <w:color w:val="000000" w:themeColor="text1"/>
-          </w:rPr>
-          <w:t>://</w:t>
-        </w:r>
-        <w:r>
-          <w:rPr>
-            <w:rStyle w:val="ac"/>
-            <w:rFonts w:ascii="Times New Roman" w:hAnsi="Times New Roman" w:cs="Times New Roman"/>
-            <w:color w:val="000000" w:themeColor="text1"/>
-            <w:lang w:val="en-US"/>
-          </w:rPr>
-          <w:t>gitlab</w:t>
-        </w:r>
-        <w:r>
-          <w:rPr>
-            <w:rStyle w:val="ac"/>
-            <w:rFonts w:ascii="Times New Roman" w:hAnsi="Times New Roman" w:cs="Times New Roman"/>
-            <w:color w:val="000000" w:themeColor="text1"/>
-          </w:rPr>
-          <w:t>.</w:t>
-        </w:r>
-        <w:r>
-          <w:rPr>
-            <w:rStyle w:val="ac"/>
-            <w:rFonts w:ascii="Times New Roman" w:hAnsi="Times New Roman" w:cs="Times New Roman"/>
-            <w:color w:val="000000" w:themeColor="text1"/>
-            <w:lang w:val="en-US"/>
-          </w:rPr>
-          <w:t>se</w:t>
-        </w:r>
-        <w:r>
-          <w:rPr>
-            <w:rStyle w:val="ac"/>
-            <w:rFonts w:ascii="Times New Roman" w:hAnsi="Times New Roman" w:cs="Times New Roman"/>
-            <w:color w:val="000000" w:themeColor="text1"/>
-          </w:rPr>
-          <w:t>.</w:t>
-        </w:r>
-        <w:r>
-          <w:rPr>
-            <w:rStyle w:val="ac"/>
-            <w:rFonts w:ascii="Times New Roman" w:hAnsi="Times New Roman" w:cs="Times New Roman"/>
-            <w:color w:val="000000" w:themeColor="text1"/>
-            <w:lang w:val="en-US"/>
-          </w:rPr>
-          <w:t>ifmo</w:t>
-        </w:r>
-        <w:r>
-          <w:rPr>
-            <w:rStyle w:val="ac"/>
-            <w:rFonts w:ascii="Times New Roman" w:hAnsi="Times New Roman" w:cs="Times New Roman"/>
-            <w:color w:val="000000" w:themeColor="text1"/>
-          </w:rPr>
-          <w:t>.</w:t>
-        </w:r>
-        <w:r>
-          <w:rPr>
-            <w:rStyle w:val="ac"/>
-            <w:rFonts w:ascii="Times New Roman" w:hAnsi="Times New Roman" w:cs="Times New Roman"/>
-            <w:color w:val="000000" w:themeColor="text1"/>
-            <w:lang w:val="en-US"/>
-          </w:rPr>
-          <w:t>ru</w:t>
-        </w:r>
-        <w:r>
-          <w:rPr>
-            <w:rStyle w:val="ac"/>
-            <w:rFonts w:ascii="Times New Roman" w:hAnsi="Times New Roman" w:cs="Times New Roman"/>
-            <w:color w:val="000000" w:themeColor="text1"/>
-          </w:rPr>
-          <w:t>/124476/</w:t>
-        </w:r>
-        <w:r>
-          <w:rPr>
-            <w:rStyle w:val="ac"/>
-            <w:rFonts w:ascii="Times New Roman" w:hAnsi="Times New Roman" w:cs="Times New Roman"/>
-            <w:color w:val="000000" w:themeColor="text1"/>
-            <w:lang w:val="en-US"/>
-          </w:rPr>
-          <w:t>itmo</w:t>
-        </w:r>
-        <w:r>
-          <w:rPr>
-            <w:rStyle w:val="ac"/>
-            <w:rFonts w:ascii="Times New Roman" w:hAnsi="Times New Roman" w:cs="Times New Roman"/>
-            <w:color w:val="000000" w:themeColor="text1"/>
-          </w:rPr>
-          <w:t>/</w:t>
-        </w:r>
-        <w:r>
-          <w:rPr>
-            <w:rStyle w:val="ac"/>
-            <w:rFonts w:ascii="Times New Roman" w:hAnsi="Times New Roman" w:cs="Times New Roman"/>
-            <w:color w:val="000000" w:themeColor="text1"/>
-            <w:lang w:val="en-US"/>
-          </w:rPr>
-          <w:t>blob</w:t>
-        </w:r>
-        <w:r>
-          <w:rPr>
-            <w:rStyle w:val="ac"/>
-            <w:rFonts w:ascii="Times New Roman" w:hAnsi="Times New Roman" w:cs="Times New Roman"/>
-            <w:color w:val="000000" w:themeColor="text1"/>
-          </w:rPr>
-          <w:t>/</w:t>
-        </w:r>
-        <w:r>
-          <w:rPr>
-            <w:rStyle w:val="ac"/>
-            <w:rFonts w:ascii="Times New Roman" w:hAnsi="Times New Roman" w:cs="Times New Roman"/>
-            <w:color w:val="000000" w:themeColor="text1"/>
-            <w:lang w:val="en-US"/>
-          </w:rPr>
-          <w:t>master</w:t>
-        </w:r>
-        <w:r>
-          <w:rPr>
-            <w:rStyle w:val="ac"/>
-            <w:rFonts w:ascii="Times New Roman" w:hAnsi="Times New Roman" w:cs="Times New Roman"/>
-            <w:color w:val="000000" w:themeColor="text1"/>
-          </w:rPr>
-          <w:t>/</w:t>
-        </w:r>
-        <w:r>
-          <w:rPr>
-            <w:rStyle w:val="ac"/>
-            <w:rFonts w:ascii="Times New Roman" w:hAnsi="Times New Roman" w:cs="Times New Roman"/>
-            <w:color w:val="000000" w:themeColor="text1"/>
-            <w:lang w:val="en-US"/>
-          </w:rPr>
-          <w:t>informatic</w:t>
-        </w:r>
-        <w:r>
-          <w:rPr>
-            <w:rStyle w:val="ac"/>
-            <w:rFonts w:ascii="Times New Roman" w:hAnsi="Times New Roman" w:cs="Times New Roman"/>
-            <w:color w:val="000000" w:themeColor="text1"/>
-          </w:rPr>
-          <w:t>/</w:t>
-        </w:r>
-        <w:r>
-          <w:rPr>
-            <w:rStyle w:val="ac"/>
-            <w:rFonts w:ascii="Times New Roman" w:hAnsi="Times New Roman" w:cs="Times New Roman"/>
-            <w:color w:val="000000" w:themeColor="text1"/>
-            <w:lang w:val="en-US"/>
-          </w:rPr>
-          <w:t>lab</w:t>
-        </w:r>
-        <w:r>
-          <w:rPr>
-            <w:rStyle w:val="ac"/>
-            <w:rFonts w:ascii="Times New Roman" w:hAnsi="Times New Roman" w:cs="Times New Roman"/>
-            <w:color w:val="000000" w:themeColor="text1"/>
-          </w:rPr>
-          <w:t>2/</w:t>
-        </w:r>
-        <w:r>
-          <w:rPr>
-            <w:rStyle w:val="ac"/>
-            <w:rFonts w:ascii="Times New Roman" w:hAnsi="Times New Roman" w:cs="Times New Roman"/>
-            <w:color w:val="000000" w:themeColor="text1"/>
-            <w:lang w:val="en-US"/>
-          </w:rPr>
-          <w:t>main</w:t>
-        </w:r>
-        <w:r>
-          <w:rPr>
-            <w:rStyle w:val="ac"/>
-            <w:rFonts w:ascii="Times New Roman" w:hAnsi="Times New Roman" w:cs="Times New Roman"/>
-            <w:color w:val="000000" w:themeColor="text1"/>
-          </w:rPr>
-          <w:t>.</w:t>
-        </w:r>
-        <w:r>
-          <w:rPr>
-            <w:rStyle w:val="ac"/>
-            <w:rFonts w:ascii="Times New Roman" w:hAnsi="Times New Roman" w:cs="Times New Roman"/>
-            <w:color w:val="000000" w:themeColor="text1"/>
-            <w:lang w:val="en-US"/>
-          </w:rPr>
-          <w:t>go</w:t>
-        </w:r>
-      </w:hyperlink>
+          <w:lang w:val="en-US"/>
+        </w:rPr>
+      </w:pPr>
+    </w:p>
+    <w:p>
+      <w:pPr>
+        <w:rPr>
+          <w:lang w:val="en-US"/>
+        </w:rPr>
+      </w:pPr>
+      <w:r>
+        <w:t xml:space="preserve">Также загрузил решение на </w:t>
+      </w:r>
+      <w:proofErr w:type="spellStart"/>
+      <w:r>
+        <w:rPr>
+          <w:lang w:val="en-US"/>
+        </w:rPr>
+        <w:t>gitlab</w:t>
+      </w:r>
+      <w:proofErr w:type="spellEnd"/>
+      <w:r>
+        <w:t xml:space="preserve"> </w:t>
+      </w:r>
+      <w:proofErr w:type="spellStart"/>
+      <w:r>
+        <w:rPr>
+          <w:lang w:val="en-US"/>
+        </w:rPr>
+        <w:t>itmo</w:t>
+      </w:r>
+      <w:proofErr w:type="spellEnd"/>
+      <w:r>
+        <w:t xml:space="preserve"> </w:t>
+      </w:r>
+      <w:r>
+        <w:t xml:space="preserve"> </w:t>
+      </w:r>
+    </w:p>
+    <w:p>
+      <w:pPr>
+        <w:rPr>
+          <w:rFonts w:ascii="Times New Roman" w:hAnsi="Times New Roman" w:cs="Times New Roman"/>
+        </w:rPr>
+      </w:pPr>
+      <w:r>
+        <w:rPr>
+          <w:rFonts w:ascii="Times New Roman" w:hAnsi="Times New Roman" w:cs="Times New Roman"/>
+          <w:lang w:val="en-US"/>
+        </w:rPr>
+        <w:fldChar w:fldCharType="begin"/>
+      </w:r>
+      <w:r>
+        <w:rPr>
+          <w:rFonts w:ascii="Times New Roman" w:hAnsi="Times New Roman" w:cs="Times New Roman"/>
+          <w:lang w:val="en-US"/>
+        </w:rPr>
+        <w:instrText>HYPERLINK "</w:instrText>
+      </w:r>
+      <w:r>
+        <w:rPr>
+          <w:rFonts w:ascii="Times New Roman" w:hAnsi="Times New Roman" w:cs="Times New Roman"/>
+          <w:lang w:val="en-US"/>
+        </w:rPr>
+        <w:instrText>https</w:instrText>
+      </w:r>
+      <w:r>
+        <w:rPr>
+          <w:rFonts w:ascii="Times New Roman" w:hAnsi="Times New Roman" w:cs="Times New Roman"/>
+        </w:rPr>
+        <w:instrText>://</w:instrText>
+      </w:r>
+      <w:r>
+        <w:rPr>
+          <w:rFonts w:ascii="Times New Roman" w:hAnsi="Times New Roman" w:cs="Times New Roman"/>
+          <w:lang w:val="en-US"/>
+        </w:rPr>
+        <w:instrText>gitlab</w:instrText>
+      </w:r>
+      <w:r>
+        <w:rPr>
+          <w:rFonts w:ascii="Times New Roman" w:hAnsi="Times New Roman" w:cs="Times New Roman"/>
+        </w:rPr>
+        <w:instrText>.</w:instrText>
+      </w:r>
+      <w:r>
+        <w:rPr>
+          <w:rFonts w:ascii="Times New Roman" w:hAnsi="Times New Roman" w:cs="Times New Roman"/>
+          <w:lang w:val="en-US"/>
+        </w:rPr>
+        <w:instrText>se</w:instrText>
+      </w:r>
+      <w:r>
+        <w:rPr>
+          <w:rFonts w:ascii="Times New Roman" w:hAnsi="Times New Roman" w:cs="Times New Roman"/>
+        </w:rPr>
+        <w:instrText>.</w:instrText>
+      </w:r>
+      <w:r>
+        <w:rPr>
+          <w:rFonts w:ascii="Times New Roman" w:hAnsi="Times New Roman" w:cs="Times New Roman"/>
+          <w:lang w:val="en-US"/>
+        </w:rPr>
+        <w:instrText>ifmo</w:instrText>
+      </w:r>
+      <w:r>
+        <w:rPr>
+          <w:rFonts w:ascii="Times New Roman" w:hAnsi="Times New Roman" w:cs="Times New Roman"/>
+        </w:rPr>
+        <w:instrText>.</w:instrText>
+      </w:r>
+      <w:r>
+        <w:rPr>
+          <w:rFonts w:ascii="Times New Roman" w:hAnsi="Times New Roman" w:cs="Times New Roman"/>
+          <w:lang w:val="en-US"/>
+        </w:rPr>
+        <w:instrText>ru</w:instrText>
+      </w:r>
+      <w:r>
+        <w:rPr>
+          <w:rFonts w:ascii="Times New Roman" w:hAnsi="Times New Roman" w:cs="Times New Roman"/>
+        </w:rPr>
+        <w:instrText>/124476/</w:instrText>
+      </w:r>
+      <w:r>
+        <w:rPr>
+          <w:rFonts w:ascii="Times New Roman" w:hAnsi="Times New Roman" w:cs="Times New Roman"/>
+          <w:lang w:val="en-US"/>
+        </w:rPr>
+        <w:instrText>informatics</w:instrText>
+      </w:r>
+    </w:p>
+    <w:p>
+      <w:pPr>
+        <w:rPr>
+          <w:rStyle w:val="ac"/>
+          <w:rFonts w:ascii="Times New Roman" w:hAnsi="Times New Roman" w:cs="Times New Roman"/>
+        </w:rPr>
+      </w:pPr>
+      <w:r>
+        <w:rPr>
+          <w:rFonts w:ascii="Times New Roman" w:hAnsi="Times New Roman" w:cs="Times New Roman"/>
+        </w:rPr>
+        <w:instrText>"</w:instrText>
+      </w:r>
+      <w:r>
+        <w:rPr>
+          <w:rFonts w:ascii="Times New Roman" w:hAnsi="Times New Roman" w:cs="Times New Roman"/>
+          <w:lang w:val="en-US"/>
+        </w:rPr>
+        <w:fldChar w:fldCharType="separate"/>
+      </w:r>
+      <w:r>
+        <w:rPr>
+          <w:rStyle w:val="ac"/>
+          <w:rFonts w:ascii="Times New Roman" w:hAnsi="Times New Roman" w:cs="Times New Roman"/>
+          <w:lang w:val="en-US"/>
+        </w:rPr>
+        <w:t>https</w:t>
+      </w:r>
+      <w:r>
+        <w:rPr>
+          <w:rStyle w:val="ac"/>
+          <w:rFonts w:ascii="Times New Roman" w:hAnsi="Times New Roman" w:cs="Times New Roman"/>
+        </w:rPr>
+        <w:t>://</w:t>
+      </w:r>
+      <w:proofErr w:type="spellStart"/>
+      <w:r>
+        <w:rPr>
+          <w:rStyle w:val="ac"/>
+          <w:rFonts w:ascii="Times New Roman" w:hAnsi="Times New Roman" w:cs="Times New Roman"/>
+          <w:lang w:val="en-US"/>
+        </w:rPr>
+        <w:t>gitlab</w:t>
+      </w:r>
+      <w:proofErr w:type="spellEnd"/>
+      <w:r>
+        <w:rPr>
+          <w:rStyle w:val="ac"/>
+          <w:rFonts w:ascii="Times New Roman" w:hAnsi="Times New Roman" w:cs="Times New Roman"/>
+        </w:rPr>
+        <w:t>.</w:t>
+      </w:r>
+      <w:r>
+        <w:rPr>
+          <w:rStyle w:val="ac"/>
+          <w:rFonts w:ascii="Times New Roman" w:hAnsi="Times New Roman" w:cs="Times New Roman"/>
+          <w:lang w:val="en-US"/>
+        </w:rPr>
+        <w:t>se</w:t>
+      </w:r>
+      <w:r>
+        <w:rPr>
+          <w:rStyle w:val="ac"/>
+          <w:rFonts w:ascii="Times New Roman" w:hAnsi="Times New Roman" w:cs="Times New Roman"/>
+        </w:rPr>
+        <w:t>.</w:t>
+      </w:r>
+      <w:proofErr w:type="spellStart"/>
+      <w:r>
+        <w:rPr>
+          <w:rStyle w:val="ac"/>
+          <w:rFonts w:ascii="Times New Roman" w:hAnsi="Times New Roman" w:cs="Times New Roman"/>
+          <w:lang w:val="en-US"/>
+        </w:rPr>
+        <w:t>ifmo</w:t>
+      </w:r>
+      <w:proofErr w:type="spellEnd"/>
+      <w:r>
+        <w:rPr>
+          <w:rStyle w:val="ac"/>
+          <w:rFonts w:ascii="Times New Roman" w:hAnsi="Times New Roman" w:cs="Times New Roman"/>
+        </w:rPr>
+        <w:t>.</w:t>
+      </w:r>
+      <w:proofErr w:type="spellStart"/>
+      <w:r>
+        <w:rPr>
+          <w:rStyle w:val="ac"/>
+          <w:rFonts w:ascii="Times New Roman" w:hAnsi="Times New Roman" w:cs="Times New Roman"/>
+          <w:lang w:val="en-US"/>
+        </w:rPr>
+        <w:t>ru</w:t>
+      </w:r>
+      <w:proofErr w:type="spellEnd"/>
+      <w:r>
+        <w:rPr>
+          <w:rStyle w:val="ac"/>
+          <w:rFonts w:ascii="Times New Roman" w:hAnsi="Times New Roman" w:cs="Times New Roman"/>
+        </w:rPr>
+        <w:t>/12447</w:t>
+      </w:r>
+      <w:r>
+        <w:rPr>
+          <w:rStyle w:val="ac"/>
+          <w:rFonts w:ascii="Times New Roman" w:hAnsi="Times New Roman" w:cs="Times New Roman"/>
+        </w:rPr>
+        <w:t>6</w:t>
+      </w:r>
+      <w:r>
+        <w:rPr>
+          <w:rStyle w:val="ac"/>
+          <w:rFonts w:ascii="Times New Roman" w:hAnsi="Times New Roman" w:cs="Times New Roman"/>
+        </w:rPr>
+        <w:t>/</w:t>
+      </w:r>
+      <w:r>
+        <w:rPr>
+          <w:rStyle w:val="ac"/>
+          <w:rFonts w:ascii="Times New Roman" w:hAnsi="Times New Roman" w:cs="Times New Roman"/>
+          <w:lang w:val="en-US"/>
+        </w:rPr>
+        <w:t>informatics</w:t>
+      </w:r>
+    </w:p>
+    <w:p>
+      <w:r>
+        <w:rPr>
+          <w:rFonts w:ascii="Times New Roman" w:hAnsi="Times New Roman" w:cs="Times New Roman"/>
+          <w:lang w:val="en-US"/>
+        </w:rPr>
+        <w:fldChar w:fldCharType="end"/>
+      </w:r>
+      <w:r>
+        <w:drawing>
+          <wp:inline distT="0" distB="0" distL="0" distR="0" wp14:anchorId="624DE7D8" wp14:editId="618DF825">
+            <wp:extent cx="5940425" cy="6744970"/>
+            <wp:effectExtent l="0" t="0" r="3175" b="0"/>
+            <wp:docPr id="623421175" name="Рисунок 1"/>
+            <wp:cNvGraphicFramePr>
+              <a:graphicFrameLocks xmlns:a="http://schemas.openxmlformats.org/drawingml/2006/main" noChangeAspect="1"/>
+            </wp:cNvGraphicFramePr>
+            <a:graphic xmlns:a="http://schemas.openxmlformats.org/drawingml/2006/main">
+              <a:graphicData uri="http://schemas.openxmlformats.org/drawingml/2006/picture">
+                <pic:pic xmlns:pic="http://schemas.openxmlformats.org/drawingml/2006/picture">
+                  <pic:nvPicPr>
+                    <pic:cNvPr id="623421175" name=""/>
+                    <pic:cNvPicPr/>
+                  </pic:nvPicPr>
+                  <pic:blipFill>
+                    <a:blip r:embed="rId16"/>
+                    <a:stretch>
+                      <a:fillRect/>
+                    </a:stretch>
+                  </pic:blipFill>
+                  <pic:spPr>
+                    <a:xfrm>
+                      <a:off x="0" y="0"/>
+                      <a:ext cx="5940425" cy="6744970"/>
+                    </a:xfrm>
+                    <a:prstGeom prst="rect">
+                      <a:avLst/>
+                    </a:prstGeom>
+                  </pic:spPr>
+                </pic:pic>
+              </a:graphicData>
+            </a:graphic>
+          </wp:inline>
+        </w:drawing>
+      </w:r>
     </w:p>
     <w:p>
       <w:pPr>
         <w:jc w:val="center"/>
+        <w:rPr>
+          <w:rFonts w:ascii="Times New Roman" w:hAnsi="Times New Roman" w:cs="Times New Roman"/>
+          <w:color w:val="000000" w:themeColor="text1"/>
+          <w:lang w:val="en-US"/>
+        </w:rPr>
+      </w:pPr>
+      <w:r>
+        <w:t xml:space="preserve">Рисунок 6 – </w:t>
+      </w:r>
+      <w:proofErr w:type="spellStart"/>
+      <w:r>
+        <w:rPr>
+          <w:lang w:val="en-US"/>
+        </w:rPr>
+        <w:t>gitlab</w:t>
+      </w:r>
+      <w:proofErr w:type="spellEnd"/>
+      <w:r>
+        <w:rPr>
+          <w:lang w:val="en-US"/>
+        </w:rPr>
+        <w:t xml:space="preserve"> </w:t>
+      </w:r>
+      <w:proofErr w:type="spellStart"/>
+      <w:r>
+        <w:rPr>
+          <w:lang w:val="en-US"/>
+        </w:rPr>
+        <w:t>itmo</w:t>
+      </w:r>
+      <w:proofErr w:type="spellEnd"/>
+    </w:p>
+    <w:p>
+      <w:pPr>
+        <w:pStyle w:val="1"/>
+        <w:jc w:val="center"/>
+        <w:rPr>
+          <w:rFonts w:ascii="Times New Roman" w:hAnsi="Times New Roman" w:cs="Times New Roman"/>
+          <w:color w:val="000000" w:themeColor="text1"/>
+        </w:rPr>
+      </w:pPr>
+      <w:bookmarkStart w:id="9" w:name="_Toc241646978"/>
+      <w:r>
+        <w:rPr>
+          <w:rFonts w:ascii="Times New Roman" w:hAnsi="Times New Roman" w:cs="Times New Roman"/>
+          <w:color w:val="000000" w:themeColor="text1"/>
+        </w:rPr>
+        <w:lastRenderedPageBreak/>
+        <w:t>Выводы по работе</w:t>
+      </w:r>
+      <w:bookmarkEnd w:id="9"/>
+    </w:p>
+    <w:p>
+      <w:pPr>
+        <w:rPr>
+          <w:rFonts w:ascii="Times New Roman" w:hAnsi="Times New Roman" w:cs="Times New Roman"/>
+          <w:color w:val="000000" w:themeColor="text1"/>
+        </w:rPr>
+      </w:pPr>
+      <w:r>
+        <w:rPr>
+          <w:rFonts w:ascii="Times New Roman" w:hAnsi="Times New Roman" w:cs="Times New Roman"/>
+          <w:color w:val="000000" w:themeColor="text1"/>
+        </w:rPr>
+        <w:t xml:space="preserve">1. </w:t>
+      </w:r>
+      <w:r>
+        <w:rPr>
+          <w:rFonts w:ascii="Times New Roman" w:hAnsi="Times New Roman" w:cs="Times New Roman"/>
+          <w:color w:val="000000" w:themeColor="text1"/>
+        </w:rPr>
+        <w:t xml:space="preserve">В процессе работы я </w:t>
+      </w:r>
+      <w:r>
+        <w:rPr>
+          <w:rFonts w:ascii="Times New Roman" w:hAnsi="Times New Roman" w:cs="Times New Roman"/>
+          <w:color w:val="000000" w:themeColor="text1"/>
+        </w:rPr>
+        <w:t>освоил</w:t>
+      </w:r>
+      <w:r>
+        <w:rPr>
+          <w:rFonts w:ascii="Times New Roman" w:hAnsi="Times New Roman" w:cs="Times New Roman"/>
+          <w:color w:val="000000" w:themeColor="text1"/>
+        </w:rPr>
+        <w:t xml:space="preserve"> </w:t>
+      </w:r>
+      <w:r>
+        <w:rPr>
+          <w:rFonts w:ascii="Times New Roman" w:hAnsi="Times New Roman" w:cs="Times New Roman"/>
+          <w:color w:val="000000" w:themeColor="text1"/>
+        </w:rPr>
+        <w:t>принципы помехоустойчивого кодирования и изучил классический код Хэмминга</w:t>
+      </w:r>
+    </w:p>
+    <w:p>
+      <w:pPr>
+        <w:rPr>
+          <w:rFonts w:ascii="Times New Roman" w:hAnsi="Times New Roman" w:cs="Times New Roman"/>
+          <w:color w:val="000000" w:themeColor="text1"/>
+        </w:rPr>
+      </w:pPr>
+      <w:r>
+        <w:rPr>
+          <w:rFonts w:ascii="Times New Roman" w:hAnsi="Times New Roman" w:cs="Times New Roman"/>
+          <w:color w:val="000000" w:themeColor="text1"/>
+        </w:rPr>
+        <w:t xml:space="preserve">2. Научился загружать решения на </w:t>
+      </w:r>
+      <w:proofErr w:type="spellStart"/>
+      <w:r>
+        <w:rPr>
+          <w:rFonts w:ascii="Times New Roman" w:hAnsi="Times New Roman" w:cs="Times New Roman"/>
+          <w:color w:val="000000" w:themeColor="text1"/>
+          <w:lang w:val="en-US"/>
+        </w:rPr>
+        <w:t>gitlab</w:t>
+      </w:r>
+      <w:proofErr w:type="spellEnd"/>
+      <w:r>
+        <w:rPr>
+          <w:rFonts w:ascii="Times New Roman" w:hAnsi="Times New Roman" w:cs="Times New Roman"/>
+          <w:color w:val="000000" w:themeColor="text1"/>
+        </w:rPr>
+        <w:t xml:space="preserve"> </w:t>
+      </w:r>
+      <w:proofErr w:type="spellStart"/>
+      <w:r>
+        <w:rPr>
+          <w:rFonts w:ascii="Times New Roman" w:hAnsi="Times New Roman" w:cs="Times New Roman"/>
+          <w:color w:val="000000" w:themeColor="text1"/>
+        </w:rPr>
+        <w:t>итмо</w:t>
+      </w:r>
+      <w:proofErr w:type="spellEnd"/>
+    </w:p>
+    <w:p>
+      <w:pPr>
         <w:rPr>
           <w:rFonts w:ascii="Times New Roman" w:hAnsi="Times New Roman" w:cs="Times New Roman"/>
           <w:color w:val="000000" w:themeColor="text1"/>
@@ -8089,88 +8265,7 @@
           <w:color w:val="000000" w:themeColor="text1"/>
         </w:rPr>
       </w:pPr>
-      <w:bookmarkStart w:id="9" w:name="_Toc241345085"/>
-      <w:r>
-        <w:rPr>
-          <w:rFonts w:ascii="Times New Roman" w:hAnsi="Times New Roman" w:cs="Times New Roman"/>
-          <w:color w:val="000000" w:themeColor="text1"/>
-        </w:rPr>
-        <w:lastRenderedPageBreak/>
-        <w:t>Выводы по работе</w:t>
-      </w:r>
-      <w:bookmarkEnd w:id="9"/>
-    </w:p>
-    <w:p>
-      <w:pPr>
-        <w:rPr>
-          <w:rFonts w:ascii="Times New Roman" w:hAnsi="Times New Roman" w:cs="Times New Roman"/>
-          <w:color w:val="000000" w:themeColor="text1"/>
-        </w:rPr>
-      </w:pPr>
-      <w:r>
-        <w:rPr>
-          <w:rFonts w:ascii="Times New Roman" w:hAnsi="Times New Roman" w:cs="Times New Roman"/>
-          <w:color w:val="000000" w:themeColor="text1"/>
-        </w:rPr>
-        <w:t xml:space="preserve">В процессе работы я </w:t>
-      </w:r>
-      <w:r>
-        <w:rPr>
-          <w:rFonts w:ascii="Times New Roman" w:hAnsi="Times New Roman" w:cs="Times New Roman"/>
-          <w:color w:val="000000" w:themeColor="text1"/>
-        </w:rPr>
-        <w:t>освоил</w:t>
-      </w:r>
-      <w:r>
-        <w:rPr>
-          <w:rFonts w:ascii="Times New Roman" w:hAnsi="Times New Roman" w:cs="Times New Roman"/>
-          <w:color w:val="000000" w:themeColor="text1"/>
-        </w:rPr>
-        <w:t xml:space="preserve"> </w:t>
-      </w:r>
-      <w:r>
-        <w:rPr>
-          <w:rFonts w:ascii="Times New Roman" w:hAnsi="Times New Roman" w:cs="Times New Roman"/>
-          <w:color w:val="000000" w:themeColor="text1"/>
-        </w:rPr>
-        <w:t>принципы помехоустойчивого кодирования и изучил классический код Хэмминга</w:t>
-      </w:r>
-    </w:p>
-    <w:p>
-      <w:pPr>
-        <w:rPr>
-          <w:rFonts w:ascii="Times New Roman" w:hAnsi="Times New Roman" w:cs="Times New Roman"/>
-          <w:color w:val="000000" w:themeColor="text1"/>
-        </w:rPr>
-      </w:pPr>
-    </w:p>
-    <w:p>
-      <w:pPr>
-        <w:rPr>
-          <w:rFonts w:ascii="Times New Roman" w:eastAsiaTheme="majorEastAsia" w:hAnsi="Times New Roman" w:cs="Times New Roman"/>
-          <w:color w:val="000000" w:themeColor="text1"/>
-          <w:sz w:val="40"/>
-          <w:szCs w:val="40"/>
-        </w:rPr>
-      </w:pPr>
-      <w:r>
-        <w:rPr>
-          <w:rFonts w:ascii="Times New Roman" w:hAnsi="Times New Roman" w:cs="Times New Roman"/>
-          <w:color w:val="000000" w:themeColor="text1"/>
-        </w:rPr>
-        <w:br w:type="page"/>
-      </w:r>
-    </w:p>
-    <w:p>
-      <w:pPr>
-        <w:pStyle w:val="1"/>
-        <w:jc w:val="center"/>
-        <w:rPr>
-          <w:rFonts w:ascii="Times New Roman" w:hAnsi="Times New Roman" w:cs="Times New Roman"/>
-          <w:color w:val="000000" w:themeColor="text1"/>
-        </w:rPr>
-      </w:pPr>
-      <w:bookmarkStart w:id="10" w:name="_Toc241345086"/>
+      <w:bookmarkStart w:id="10" w:name="_Toc241646979"/>
       <w:r>
         <w:rPr>
           <w:rFonts w:ascii="Times New Roman" w:hAnsi="Times New Roman" w:cs="Times New Roman"/>
@@ -8357,6 +8452,7 @@
           </w:rPr>
           <w:t>://</w:t>
         </w:r>
+        <w:proofErr w:type="spellStart"/>
         <w:r>
           <w:rPr>
             <w:rStyle w:val="ac"/>
@@ -8365,6 +8461,7 @@
           </w:rPr>
           <w:t>worrydream</w:t>
         </w:r>
+        <w:proofErr w:type="spellEnd"/>
         <w:r>
           <w:rPr>
             <w:rStyle w:val="ac"/>

</xml_diff>

<commit_message>
Refresh: color link in report lab2 infa
</commit_message>
<xml_diff>
--- a/informatic/lab2/report.docx
+++ b/informatic/lab2/report.docx
@@ -452,6 +452,7 @@
             <w:rPr>
               <w:rFonts w:eastAsiaTheme="minorEastAsia"/>
               <w:noProof/>
+              <w:color w:val="000000" w:themeColor="text1"/>
               <w:lang w:eastAsia="ru-RU"/>
             </w:rPr>
           </w:pPr>
@@ -482,6 +483,7 @@
                 <w:rStyle w:val="ac"/>
                 <w:rFonts w:ascii="Times New Roman" w:hAnsi="Times New Roman" w:cs="Times New Roman"/>
                 <w:noProof/>
+                <w:color w:val="000000" w:themeColor="text1"/>
               </w:rPr>
               <w:t>Задание</w:t>
             </w:r>
@@ -489,6 +491,7 @@
               <w:rPr>
                 <w:noProof/>
                 <w:webHidden/>
+                <w:color w:val="000000" w:themeColor="text1"/>
               </w:rPr>
               <w:tab/>
             </w:r>
@@ -496,6 +499,7 @@
               <w:rPr>
                 <w:noProof/>
                 <w:webHidden/>
+                <w:color w:val="000000" w:themeColor="text1"/>
               </w:rPr>
               <w:fldChar w:fldCharType="begin"/>
             </w:r>
@@ -503,6 +507,7 @@
               <w:rPr>
                 <w:noProof/>
                 <w:webHidden/>
+                <w:color w:val="000000" w:themeColor="text1"/>
               </w:rPr>
               <w:instrText xml:space="preserve"> PAGEREF _Toc241646969 \h </w:instrText>
             </w:r>
@@ -510,12 +515,14 @@
               <w:rPr>
                 <w:noProof/>
                 <w:webHidden/>
+                <w:color w:val="000000" w:themeColor="text1"/>
               </w:rPr>
             </w:r>
             <w:r>
               <w:rPr>
                 <w:noProof/>
                 <w:webHidden/>
+                <w:color w:val="000000" w:themeColor="text1"/>
               </w:rPr>
               <w:fldChar w:fldCharType="separate"/>
             </w:r>
@@ -523,6 +530,7 @@
               <w:rPr>
                 <w:noProof/>
                 <w:webHidden/>
+                <w:color w:val="000000" w:themeColor="text1"/>
               </w:rPr>
               <w:t>3</w:t>
             </w:r>
@@ -530,6 +538,7 @@
               <w:rPr>
                 <w:noProof/>
                 <w:webHidden/>
+                <w:color w:val="000000" w:themeColor="text1"/>
               </w:rPr>
               <w:fldChar w:fldCharType="end"/>
             </w:r>
@@ -544,6 +553,7 @@
             <w:rPr>
               <w:rFonts w:eastAsiaTheme="minorEastAsia"/>
               <w:noProof/>
+              <w:color w:val="000000" w:themeColor="text1"/>
               <w:lang w:eastAsia="ru-RU"/>
             </w:rPr>
           </w:pPr>
@@ -553,6 +563,7 @@
                 <w:rStyle w:val="ac"/>
                 <w:rFonts w:ascii="Times New Roman" w:hAnsi="Times New Roman" w:cs="Times New Roman"/>
                 <w:noProof/>
+                <w:color w:val="000000" w:themeColor="text1"/>
               </w:rPr>
               <w:t>Основные этапы вычисления</w:t>
             </w:r>
@@ -560,6 +571,7 @@
               <w:rPr>
                 <w:noProof/>
                 <w:webHidden/>
+                <w:color w:val="000000" w:themeColor="text1"/>
               </w:rPr>
               <w:tab/>
             </w:r>
@@ -567,6 +579,7 @@
               <w:rPr>
                 <w:noProof/>
                 <w:webHidden/>
+                <w:color w:val="000000" w:themeColor="text1"/>
               </w:rPr>
               <w:fldChar w:fldCharType="begin"/>
             </w:r>
@@ -574,6 +587,7 @@
               <w:rPr>
                 <w:noProof/>
                 <w:webHidden/>
+                <w:color w:val="000000" w:themeColor="text1"/>
               </w:rPr>
               <w:instrText xml:space="preserve"> PAGEREF _Toc241646970 \h </w:instrText>
             </w:r>
@@ -581,12 +595,14 @@
               <w:rPr>
                 <w:noProof/>
                 <w:webHidden/>
+                <w:color w:val="000000" w:themeColor="text1"/>
               </w:rPr>
             </w:r>
             <w:r>
               <w:rPr>
                 <w:noProof/>
                 <w:webHidden/>
+                <w:color w:val="000000" w:themeColor="text1"/>
               </w:rPr>
               <w:fldChar w:fldCharType="separate"/>
             </w:r>
@@ -594,6 +610,7 @@
               <w:rPr>
                 <w:noProof/>
                 <w:webHidden/>
+                <w:color w:val="000000" w:themeColor="text1"/>
               </w:rPr>
               <w:t>4</w:t>
             </w:r>
@@ -601,6 +618,7 @@
               <w:rPr>
                 <w:noProof/>
                 <w:webHidden/>
+                <w:color w:val="000000" w:themeColor="text1"/>
               </w:rPr>
               <w:fldChar w:fldCharType="end"/>
             </w:r>
@@ -615,6 +633,7 @@
             <w:rPr>
               <w:rFonts w:eastAsiaTheme="minorEastAsia"/>
               <w:noProof/>
+              <w:color w:val="000000" w:themeColor="text1"/>
               <w:lang w:eastAsia="ru-RU"/>
             </w:rPr>
           </w:pPr>
@@ -624,6 +643,7 @@
                 <w:rStyle w:val="ac"/>
                 <w:rFonts w:ascii="Times New Roman" w:hAnsi="Times New Roman" w:cs="Times New Roman"/>
                 <w:noProof/>
+                <w:color w:val="000000" w:themeColor="text1"/>
               </w:rPr>
               <w:t>Задание 1.1 - №27</w:t>
             </w:r>
@@ -631,6 +651,7 @@
               <w:rPr>
                 <w:noProof/>
                 <w:webHidden/>
+                <w:color w:val="000000" w:themeColor="text1"/>
               </w:rPr>
               <w:tab/>
             </w:r>
@@ -638,6 +659,7 @@
               <w:rPr>
                 <w:noProof/>
                 <w:webHidden/>
+                <w:color w:val="000000" w:themeColor="text1"/>
               </w:rPr>
               <w:fldChar w:fldCharType="begin"/>
             </w:r>
@@ -645,6 +667,7 @@
               <w:rPr>
                 <w:noProof/>
                 <w:webHidden/>
+                <w:color w:val="000000" w:themeColor="text1"/>
               </w:rPr>
               <w:instrText xml:space="preserve"> PAGEREF _Toc241646971 \h </w:instrText>
             </w:r>
@@ -652,12 +675,14 @@
               <w:rPr>
                 <w:noProof/>
                 <w:webHidden/>
+                <w:color w:val="000000" w:themeColor="text1"/>
               </w:rPr>
             </w:r>
             <w:r>
               <w:rPr>
                 <w:noProof/>
                 <w:webHidden/>
+                <w:color w:val="000000" w:themeColor="text1"/>
               </w:rPr>
               <w:fldChar w:fldCharType="separate"/>
             </w:r>
@@ -665,6 +690,7 @@
               <w:rPr>
                 <w:noProof/>
                 <w:webHidden/>
+                <w:color w:val="000000" w:themeColor="text1"/>
               </w:rPr>
               <w:t>4</w:t>
             </w:r>
@@ -672,6 +698,7 @@
               <w:rPr>
                 <w:noProof/>
                 <w:webHidden/>
+                <w:color w:val="000000" w:themeColor="text1"/>
               </w:rPr>
               <w:fldChar w:fldCharType="end"/>
             </w:r>
@@ -686,6 +713,7 @@
             <w:rPr>
               <w:rFonts w:eastAsiaTheme="minorEastAsia"/>
               <w:noProof/>
+              <w:color w:val="000000" w:themeColor="text1"/>
               <w:lang w:eastAsia="ru-RU"/>
             </w:rPr>
           </w:pPr>
@@ -695,6 +723,7 @@
                 <w:rStyle w:val="ac"/>
                 <w:rFonts w:ascii="Times New Roman" w:hAnsi="Times New Roman" w:cs="Times New Roman"/>
                 <w:noProof/>
+                <w:color w:val="000000" w:themeColor="text1"/>
               </w:rPr>
               <w:t>Задание 1.2 - №54</w:t>
             </w:r>
@@ -702,6 +731,7 @@
               <w:rPr>
                 <w:noProof/>
                 <w:webHidden/>
+                <w:color w:val="000000" w:themeColor="text1"/>
               </w:rPr>
               <w:tab/>
             </w:r>
@@ -709,6 +739,7 @@
               <w:rPr>
                 <w:noProof/>
                 <w:webHidden/>
+                <w:color w:val="000000" w:themeColor="text1"/>
               </w:rPr>
               <w:fldChar w:fldCharType="begin"/>
             </w:r>
@@ -716,6 +747,7 @@
               <w:rPr>
                 <w:noProof/>
                 <w:webHidden/>
+                <w:color w:val="000000" w:themeColor="text1"/>
               </w:rPr>
               <w:instrText xml:space="preserve"> PAGEREF _Toc241646972 \h </w:instrText>
             </w:r>
@@ -723,12 +755,14 @@
               <w:rPr>
                 <w:noProof/>
                 <w:webHidden/>
+                <w:color w:val="000000" w:themeColor="text1"/>
               </w:rPr>
             </w:r>
             <w:r>
               <w:rPr>
                 <w:noProof/>
                 <w:webHidden/>
+                <w:color w:val="000000" w:themeColor="text1"/>
               </w:rPr>
               <w:fldChar w:fldCharType="separate"/>
             </w:r>
@@ -736,6 +770,7 @@
               <w:rPr>
                 <w:noProof/>
                 <w:webHidden/>
+                <w:color w:val="000000" w:themeColor="text1"/>
               </w:rPr>
               <w:t>4</w:t>
             </w:r>
@@ -743,6 +778,7 @@
               <w:rPr>
                 <w:noProof/>
                 <w:webHidden/>
+                <w:color w:val="000000" w:themeColor="text1"/>
               </w:rPr>
               <w:fldChar w:fldCharType="end"/>
             </w:r>
@@ -757,6 +793,7 @@
             <w:rPr>
               <w:rFonts w:eastAsiaTheme="minorEastAsia"/>
               <w:noProof/>
+              <w:color w:val="000000" w:themeColor="text1"/>
               <w:lang w:eastAsia="ru-RU"/>
             </w:rPr>
           </w:pPr>
@@ -766,6 +803,7 @@
                 <w:rStyle w:val="ac"/>
                 <w:rFonts w:ascii="Times New Roman" w:hAnsi="Times New Roman" w:cs="Times New Roman"/>
                 <w:noProof/>
+                <w:color w:val="000000" w:themeColor="text1"/>
               </w:rPr>
               <w:t>Задание 1.3 - №81</w:t>
             </w:r>
@@ -773,6 +811,7 @@
               <w:rPr>
                 <w:noProof/>
                 <w:webHidden/>
+                <w:color w:val="000000" w:themeColor="text1"/>
               </w:rPr>
               <w:tab/>
             </w:r>
@@ -780,6 +819,7 @@
               <w:rPr>
                 <w:noProof/>
                 <w:webHidden/>
+                <w:color w:val="000000" w:themeColor="text1"/>
               </w:rPr>
               <w:fldChar w:fldCharType="begin"/>
             </w:r>
@@ -787,6 +827,7 @@
               <w:rPr>
                 <w:noProof/>
                 <w:webHidden/>
+                <w:color w:val="000000" w:themeColor="text1"/>
               </w:rPr>
               <w:instrText xml:space="preserve"> PAGEREF _Toc241646973 \h </w:instrText>
             </w:r>
@@ -794,12 +835,14 @@
               <w:rPr>
                 <w:noProof/>
                 <w:webHidden/>
+                <w:color w:val="000000" w:themeColor="text1"/>
               </w:rPr>
             </w:r>
             <w:r>
               <w:rPr>
                 <w:noProof/>
                 <w:webHidden/>
+                <w:color w:val="000000" w:themeColor="text1"/>
               </w:rPr>
               <w:fldChar w:fldCharType="separate"/>
             </w:r>
@@ -807,6 +850,7 @@
               <w:rPr>
                 <w:noProof/>
                 <w:webHidden/>
+                <w:color w:val="000000" w:themeColor="text1"/>
               </w:rPr>
               <w:t>5</w:t>
             </w:r>
@@ -814,6 +858,7 @@
               <w:rPr>
                 <w:noProof/>
                 <w:webHidden/>
+                <w:color w:val="000000" w:themeColor="text1"/>
               </w:rPr>
               <w:fldChar w:fldCharType="end"/>
             </w:r>
@@ -828,6 +873,7 @@
             <w:rPr>
               <w:rFonts w:eastAsiaTheme="minorEastAsia"/>
               <w:noProof/>
+              <w:color w:val="000000" w:themeColor="text1"/>
               <w:lang w:eastAsia="ru-RU"/>
             </w:rPr>
           </w:pPr>
@@ -837,6 +883,7 @@
                 <w:rStyle w:val="ac"/>
                 <w:rFonts w:ascii="Times New Roman" w:hAnsi="Times New Roman" w:cs="Times New Roman"/>
                 <w:noProof/>
+                <w:color w:val="000000" w:themeColor="text1"/>
               </w:rPr>
               <w:t>Задание 1.4 - №108</w:t>
             </w:r>
@@ -844,6 +891,7 @@
               <w:rPr>
                 <w:noProof/>
                 <w:webHidden/>
+                <w:color w:val="000000" w:themeColor="text1"/>
               </w:rPr>
               <w:tab/>
             </w:r>
@@ -851,6 +899,7 @@
               <w:rPr>
                 <w:noProof/>
                 <w:webHidden/>
+                <w:color w:val="000000" w:themeColor="text1"/>
               </w:rPr>
               <w:fldChar w:fldCharType="begin"/>
             </w:r>
@@ -858,6 +907,7 @@
               <w:rPr>
                 <w:noProof/>
                 <w:webHidden/>
+                <w:color w:val="000000" w:themeColor="text1"/>
               </w:rPr>
               <w:instrText xml:space="preserve"> PAGEREF _Toc241646974 \h </w:instrText>
             </w:r>
@@ -865,12 +915,14 @@
               <w:rPr>
                 <w:noProof/>
                 <w:webHidden/>
+                <w:color w:val="000000" w:themeColor="text1"/>
               </w:rPr>
             </w:r>
             <w:r>
               <w:rPr>
                 <w:noProof/>
                 <w:webHidden/>
+                <w:color w:val="000000" w:themeColor="text1"/>
               </w:rPr>
               <w:fldChar w:fldCharType="separate"/>
             </w:r>
@@ -878,6 +930,7 @@
               <w:rPr>
                 <w:noProof/>
                 <w:webHidden/>
+                <w:color w:val="000000" w:themeColor="text1"/>
               </w:rPr>
               <w:t>5</w:t>
             </w:r>
@@ -885,6 +938,7 @@
               <w:rPr>
                 <w:noProof/>
                 <w:webHidden/>
+                <w:color w:val="000000" w:themeColor="text1"/>
               </w:rPr>
               <w:fldChar w:fldCharType="end"/>
             </w:r>
@@ -899,6 +953,7 @@
             <w:rPr>
               <w:rFonts w:eastAsiaTheme="minorEastAsia"/>
               <w:noProof/>
+              <w:color w:val="000000" w:themeColor="text1"/>
               <w:lang w:eastAsia="ru-RU"/>
             </w:rPr>
           </w:pPr>
@@ -908,6 +963,7 @@
                 <w:rStyle w:val="ac"/>
                 <w:rFonts w:ascii="Times New Roman" w:hAnsi="Times New Roman" w:cs="Times New Roman"/>
                 <w:noProof/>
+                <w:color w:val="000000" w:themeColor="text1"/>
               </w:rPr>
               <w:t>Задание 2 - №32</w:t>
             </w:r>
@@ -915,6 +971,7 @@
               <w:rPr>
                 <w:noProof/>
                 <w:webHidden/>
+                <w:color w:val="000000" w:themeColor="text1"/>
               </w:rPr>
               <w:tab/>
             </w:r>
@@ -922,6 +979,7 @@
               <w:rPr>
                 <w:noProof/>
                 <w:webHidden/>
+                <w:color w:val="000000" w:themeColor="text1"/>
               </w:rPr>
               <w:fldChar w:fldCharType="begin"/>
             </w:r>
@@ -929,6 +987,7 @@
               <w:rPr>
                 <w:noProof/>
                 <w:webHidden/>
+                <w:color w:val="000000" w:themeColor="text1"/>
               </w:rPr>
               <w:instrText xml:space="preserve"> PAGEREF _Toc241646975 \h </w:instrText>
             </w:r>
@@ -936,12 +995,14 @@
               <w:rPr>
                 <w:noProof/>
                 <w:webHidden/>
+                <w:color w:val="000000" w:themeColor="text1"/>
               </w:rPr>
             </w:r>
             <w:r>
               <w:rPr>
                 <w:noProof/>
                 <w:webHidden/>
+                <w:color w:val="000000" w:themeColor="text1"/>
               </w:rPr>
               <w:fldChar w:fldCharType="separate"/>
             </w:r>
@@ -949,6 +1010,7 @@
               <w:rPr>
                 <w:noProof/>
                 <w:webHidden/>
+                <w:color w:val="000000" w:themeColor="text1"/>
               </w:rPr>
               <w:t>6</w:t>
             </w:r>
@@ -956,6 +1018,7 @@
               <w:rPr>
                 <w:noProof/>
                 <w:webHidden/>
+                <w:color w:val="000000" w:themeColor="text1"/>
               </w:rPr>
               <w:fldChar w:fldCharType="end"/>
             </w:r>
@@ -970,6 +1033,7 @@
             <w:rPr>
               <w:rFonts w:eastAsiaTheme="minorEastAsia"/>
               <w:noProof/>
+              <w:color w:val="000000" w:themeColor="text1"/>
               <w:lang w:eastAsia="ru-RU"/>
             </w:rPr>
           </w:pPr>
@@ -979,6 +1043,7 @@
                 <w:rStyle w:val="ac"/>
                 <w:rFonts w:ascii="Times New Roman" w:hAnsi="Times New Roman" w:cs="Times New Roman"/>
                 <w:noProof/>
+                <w:color w:val="000000" w:themeColor="text1"/>
               </w:rPr>
               <w:t>Задание 3 - №1208</w:t>
             </w:r>
@@ -986,6 +1051,7 @@
               <w:rPr>
                 <w:noProof/>
                 <w:webHidden/>
+                <w:color w:val="000000" w:themeColor="text1"/>
               </w:rPr>
               <w:tab/>
             </w:r>
@@ -993,6 +1059,7 @@
               <w:rPr>
                 <w:noProof/>
                 <w:webHidden/>
+                <w:color w:val="000000" w:themeColor="text1"/>
               </w:rPr>
               <w:fldChar w:fldCharType="begin"/>
             </w:r>
@@ -1000,6 +1067,7 @@
               <w:rPr>
                 <w:noProof/>
                 <w:webHidden/>
+                <w:color w:val="000000" w:themeColor="text1"/>
               </w:rPr>
               <w:instrText xml:space="preserve"> PAGEREF _Toc241646976 \h </w:instrText>
             </w:r>
@@ -1007,12 +1075,14 @@
               <w:rPr>
                 <w:noProof/>
                 <w:webHidden/>
+                <w:color w:val="000000" w:themeColor="text1"/>
               </w:rPr>
             </w:r>
             <w:r>
               <w:rPr>
                 <w:noProof/>
                 <w:webHidden/>
+                <w:color w:val="000000" w:themeColor="text1"/>
               </w:rPr>
               <w:fldChar w:fldCharType="separate"/>
             </w:r>
@@ -1020,6 +1090,7 @@
               <w:rPr>
                 <w:noProof/>
                 <w:webHidden/>
+                <w:color w:val="000000" w:themeColor="text1"/>
               </w:rPr>
               <w:t>6</w:t>
             </w:r>
@@ -1027,6 +1098,7 @@
               <w:rPr>
                 <w:noProof/>
                 <w:webHidden/>
+                <w:color w:val="000000" w:themeColor="text1"/>
               </w:rPr>
               <w:fldChar w:fldCharType="end"/>
             </w:r>
@@ -1041,6 +1113,7 @@
             <w:rPr>
               <w:rFonts w:eastAsiaTheme="minorEastAsia"/>
               <w:noProof/>
+              <w:color w:val="000000" w:themeColor="text1"/>
               <w:lang w:eastAsia="ru-RU"/>
             </w:rPr>
           </w:pPr>
@@ -1050,6 +1123,7 @@
                 <w:rStyle w:val="ac"/>
                 <w:rFonts w:ascii="Times New Roman" w:hAnsi="Times New Roman" w:cs="Times New Roman"/>
                 <w:noProof/>
+                <w:color w:val="000000" w:themeColor="text1"/>
               </w:rPr>
               <w:t>Задание 4</w:t>
             </w:r>
@@ -1057,6 +1131,7 @@
               <w:rPr>
                 <w:noProof/>
                 <w:webHidden/>
+                <w:color w:val="000000" w:themeColor="text1"/>
               </w:rPr>
               <w:tab/>
             </w:r>
@@ -1064,6 +1139,7 @@
               <w:rPr>
                 <w:noProof/>
                 <w:webHidden/>
+                <w:color w:val="000000" w:themeColor="text1"/>
               </w:rPr>
               <w:fldChar w:fldCharType="begin"/>
             </w:r>
@@ -1071,6 +1147,7 @@
               <w:rPr>
                 <w:noProof/>
                 <w:webHidden/>
+                <w:color w:val="000000" w:themeColor="text1"/>
               </w:rPr>
               <w:instrText xml:space="preserve"> PAGEREF _Toc241646977 \h </w:instrText>
             </w:r>
@@ -1078,12 +1155,14 @@
               <w:rPr>
                 <w:noProof/>
                 <w:webHidden/>
+                <w:color w:val="000000" w:themeColor="text1"/>
               </w:rPr>
             </w:r>
             <w:r>
               <w:rPr>
                 <w:noProof/>
                 <w:webHidden/>
+                <w:color w:val="000000" w:themeColor="text1"/>
               </w:rPr>
               <w:fldChar w:fldCharType="separate"/>
             </w:r>
@@ -1091,6 +1170,7 @@
               <w:rPr>
                 <w:noProof/>
                 <w:webHidden/>
+                <w:color w:val="000000" w:themeColor="text1"/>
               </w:rPr>
               <w:t>7</w:t>
             </w:r>
@@ -1098,6 +1178,7 @@
               <w:rPr>
                 <w:noProof/>
                 <w:webHidden/>
+                <w:color w:val="000000" w:themeColor="text1"/>
               </w:rPr>
               <w:fldChar w:fldCharType="end"/>
             </w:r>
@@ -1112,6 +1193,7 @@
             <w:rPr>
               <w:rFonts w:eastAsiaTheme="minorEastAsia"/>
               <w:noProof/>
+              <w:color w:val="000000" w:themeColor="text1"/>
               <w:lang w:eastAsia="ru-RU"/>
             </w:rPr>
           </w:pPr>
@@ -1121,6 +1203,7 @@
                 <w:rStyle w:val="ac"/>
                 <w:rFonts w:ascii="Times New Roman" w:hAnsi="Times New Roman" w:cs="Times New Roman"/>
                 <w:noProof/>
+                <w:color w:val="000000" w:themeColor="text1"/>
               </w:rPr>
               <w:t>Выводы по работе</w:t>
             </w:r>
@@ -1128,6 +1211,7 @@
               <w:rPr>
                 <w:noProof/>
                 <w:webHidden/>
+                <w:color w:val="000000" w:themeColor="text1"/>
               </w:rPr>
               <w:tab/>
             </w:r>
@@ -1135,6 +1219,7 @@
               <w:rPr>
                 <w:noProof/>
                 <w:webHidden/>
+                <w:color w:val="000000" w:themeColor="text1"/>
               </w:rPr>
               <w:fldChar w:fldCharType="begin"/>
             </w:r>
@@ -1142,6 +1227,7 @@
               <w:rPr>
                 <w:noProof/>
                 <w:webHidden/>
+                <w:color w:val="000000" w:themeColor="text1"/>
               </w:rPr>
               <w:instrText xml:space="preserve"> PAGEREF _Toc241646978 \h </w:instrText>
             </w:r>
@@ -1149,12 +1235,14 @@
               <w:rPr>
                 <w:noProof/>
                 <w:webHidden/>
+                <w:color w:val="000000" w:themeColor="text1"/>
               </w:rPr>
             </w:r>
             <w:r>
               <w:rPr>
                 <w:noProof/>
                 <w:webHidden/>
+                <w:color w:val="000000" w:themeColor="text1"/>
               </w:rPr>
               <w:fldChar w:fldCharType="separate"/>
             </w:r>
@@ -1162,6 +1250,7 @@
               <w:rPr>
                 <w:noProof/>
                 <w:webHidden/>
+                <w:color w:val="000000" w:themeColor="text1"/>
               </w:rPr>
               <w:t>8</w:t>
             </w:r>
@@ -1169,6 +1258,7 @@
               <w:rPr>
                 <w:noProof/>
                 <w:webHidden/>
+                <w:color w:val="000000" w:themeColor="text1"/>
               </w:rPr>
               <w:fldChar w:fldCharType="end"/>
             </w:r>
@@ -1183,6 +1273,7 @@
             <w:rPr>
               <w:rFonts w:eastAsiaTheme="minorEastAsia"/>
               <w:noProof/>
+              <w:color w:val="000000" w:themeColor="text1"/>
               <w:lang w:eastAsia="ru-RU"/>
             </w:rPr>
           </w:pPr>
@@ -1192,6 +1283,7 @@
                 <w:rStyle w:val="ac"/>
                 <w:rFonts w:ascii="Times New Roman" w:hAnsi="Times New Roman" w:cs="Times New Roman"/>
                 <w:noProof/>
+                <w:color w:val="000000" w:themeColor="text1"/>
               </w:rPr>
               <w:t>Список литературы</w:t>
             </w:r>
@@ -1199,6 +1291,7 @@
               <w:rPr>
                 <w:noProof/>
                 <w:webHidden/>
+                <w:color w:val="000000" w:themeColor="text1"/>
               </w:rPr>
               <w:tab/>
             </w:r>
@@ -1206,6 +1299,7 @@
               <w:rPr>
                 <w:noProof/>
                 <w:webHidden/>
+                <w:color w:val="000000" w:themeColor="text1"/>
               </w:rPr>
               <w:fldChar w:fldCharType="begin"/>
             </w:r>
@@ -1213,6 +1307,7 @@
               <w:rPr>
                 <w:noProof/>
                 <w:webHidden/>
+                <w:color w:val="000000" w:themeColor="text1"/>
               </w:rPr>
               <w:instrText xml:space="preserve"> PAGEREF _Toc241646979 \h </w:instrText>
             </w:r>
@@ -1220,12 +1315,14 @@
               <w:rPr>
                 <w:noProof/>
                 <w:webHidden/>
+                <w:color w:val="000000" w:themeColor="text1"/>
               </w:rPr>
             </w:r>
             <w:r>
               <w:rPr>
                 <w:noProof/>
                 <w:webHidden/>
+                <w:color w:val="000000" w:themeColor="text1"/>
               </w:rPr>
               <w:fldChar w:fldCharType="separate"/>
             </w:r>
@@ -1233,6 +1330,7 @@
               <w:rPr>
                 <w:noProof/>
                 <w:webHidden/>
+                <w:color w:val="000000" w:themeColor="text1"/>
               </w:rPr>
               <w:t>9</w:t>
             </w:r>
@@ -1240,6 +1338,7 @@
               <w:rPr>
                 <w:noProof/>
                 <w:webHidden/>
+                <w:color w:val="000000" w:themeColor="text1"/>
               </w:rPr>
               <w:fldChar w:fldCharType="end"/>
             </w:r>
@@ -1421,6 +1520,7 @@
       <w:r>
         <w:rPr>
           <w:noProof/>
+          <w:color w:val="000000" w:themeColor="text1"/>
         </w:rPr>
         <w:drawing>
           <wp:inline distT="0" distB="0" distL="0" distR="0" wp14:anchorId="1B35DC29" wp14:editId="05607715">
@@ -1556,35 +1656,7 @@
           <w:rFonts w:ascii="Times New Roman" w:hAnsi="Times New Roman" w:cs="Times New Roman"/>
           <w:color w:val="000000" w:themeColor="text1"/>
         </w:rPr>
-        <w:t xml:space="preserve">Составлю </w:t>
-      </w:r>
-      <w:r>
-        <w:rPr>
-          <w:rFonts w:ascii="Times New Roman" w:hAnsi="Times New Roman" w:cs="Times New Roman"/>
-          <w:color w:val="000000" w:themeColor="text1"/>
-        </w:rPr>
-        <w:t>схем</w:t>
-      </w:r>
-      <w:r>
-        <w:rPr>
-          <w:rFonts w:ascii="Times New Roman" w:hAnsi="Times New Roman" w:cs="Times New Roman"/>
-          <w:color w:val="000000" w:themeColor="text1"/>
-        </w:rPr>
-        <w:t>у</w:t>
-      </w:r>
-      <w:r>
-        <w:rPr>
-          <w:rFonts w:ascii="Times New Roman" w:hAnsi="Times New Roman" w:cs="Times New Roman"/>
-          <w:color w:val="000000" w:themeColor="text1"/>
-        </w:rPr>
-        <w:t xml:space="preserve"> декодирования классического кода Хэмминга</w:t>
-      </w:r>
-      <w:r>
-        <w:rPr>
-          <w:rFonts w:ascii="Times New Roman" w:hAnsi="Times New Roman" w:cs="Times New Roman"/>
-          <w:color w:val="000000" w:themeColor="text1"/>
-        </w:rPr>
-        <w:t xml:space="preserve"> для сообщения 1110001</w:t>
+        <w:t>Составлю схему декодирования классического кода Хэмминга для сообщения 1110001</w:t>
       </w:r>
     </w:p>
     <w:p>
@@ -2434,7 +2506,6 @@
         </w:rPr>
         <w:t xml:space="preserve"> </w:t>
       </w:r>
-      <w:proofErr w:type="spellStart"/>
       <w:r>
         <w:rPr>
           <w:rFonts w:ascii="Times New Roman" w:hAnsi="Times New Roman" w:cs="Times New Roman"/>
@@ -2443,7 +2514,6 @@
         </w:rPr>
         <w:t>i</w:t>
       </w:r>
-      <w:proofErr w:type="spellEnd"/>
       <w:r>
         <w:rPr>
           <w:rFonts w:ascii="Times New Roman" w:hAnsi="Times New Roman" w:cs="Times New Roman"/>
@@ -2533,35 +2603,7 @@
           <w:rFonts w:ascii="Times New Roman" w:hAnsi="Times New Roman" w:cs="Times New Roman"/>
           <w:color w:val="000000" w:themeColor="text1"/>
         </w:rPr>
-        <w:t xml:space="preserve">Составлю </w:t>
-      </w:r>
-      <w:r>
-        <w:rPr>
-          <w:rFonts w:ascii="Times New Roman" w:hAnsi="Times New Roman" w:cs="Times New Roman"/>
-          <w:color w:val="000000" w:themeColor="text1"/>
-        </w:rPr>
-        <w:t>схем</w:t>
-      </w:r>
-      <w:r>
-        <w:rPr>
-          <w:rFonts w:ascii="Times New Roman" w:hAnsi="Times New Roman" w:cs="Times New Roman"/>
-          <w:color w:val="000000" w:themeColor="text1"/>
-        </w:rPr>
-        <w:t>у</w:t>
-      </w:r>
-      <w:r>
-        <w:rPr>
-          <w:rFonts w:ascii="Times New Roman" w:hAnsi="Times New Roman" w:cs="Times New Roman"/>
-          <w:color w:val="000000" w:themeColor="text1"/>
-        </w:rPr>
-        <w:t xml:space="preserve"> декодирования классического кода Хэмминга</w:t>
-      </w:r>
-      <w:r>
-        <w:rPr>
-          <w:rFonts w:ascii="Times New Roman" w:hAnsi="Times New Roman" w:cs="Times New Roman"/>
-          <w:color w:val="000000" w:themeColor="text1"/>
-        </w:rPr>
-        <w:t xml:space="preserve"> для сообщения 1101011</w:t>
+        <w:t>Составлю схему декодирования классического кода Хэмминга для сообщения 1101011</w:t>
       </w:r>
     </w:p>
     <w:p>
@@ -3370,7 +3412,6 @@
         </w:rPr>
         <w:t xml:space="preserve">1), то есть в (1, 1, 0) =&gt; 6 бит, то есть </w:t>
       </w:r>
-      <w:proofErr w:type="spellStart"/>
       <w:r>
         <w:rPr>
           <w:rFonts w:ascii="Times New Roman" w:hAnsi="Times New Roman" w:cs="Times New Roman"/>
@@ -3379,7 +3420,6 @@
         </w:rPr>
         <w:t>i</w:t>
       </w:r>
-      <w:proofErr w:type="spellEnd"/>
       <w:r>
         <w:rPr>
           <w:rFonts w:ascii="Times New Roman" w:hAnsi="Times New Roman" w:cs="Times New Roman"/>
@@ -3449,35 +3489,7 @@
           <w:rFonts w:ascii="Times New Roman" w:hAnsi="Times New Roman" w:cs="Times New Roman"/>
           <w:color w:val="000000" w:themeColor="text1"/>
         </w:rPr>
-        <w:t xml:space="preserve">Составлю </w:t>
-      </w:r>
-      <w:r>
-        <w:rPr>
-          <w:rFonts w:ascii="Times New Roman" w:hAnsi="Times New Roman" w:cs="Times New Roman"/>
-          <w:color w:val="000000" w:themeColor="text1"/>
-        </w:rPr>
-        <w:t>схем</w:t>
-      </w:r>
-      <w:r>
-        <w:rPr>
-          <w:rFonts w:ascii="Times New Roman" w:hAnsi="Times New Roman" w:cs="Times New Roman"/>
-          <w:color w:val="000000" w:themeColor="text1"/>
-        </w:rPr>
-        <w:t>у</w:t>
-      </w:r>
-      <w:r>
-        <w:rPr>
-          <w:rFonts w:ascii="Times New Roman" w:hAnsi="Times New Roman" w:cs="Times New Roman"/>
-          <w:color w:val="000000" w:themeColor="text1"/>
-        </w:rPr>
-        <w:t xml:space="preserve"> декодирования классического кода Хэмминга</w:t>
-      </w:r>
-      <w:r>
-        <w:rPr>
-          <w:rFonts w:ascii="Times New Roman" w:hAnsi="Times New Roman" w:cs="Times New Roman"/>
-          <w:color w:val="000000" w:themeColor="text1"/>
-        </w:rPr>
-        <w:t xml:space="preserve"> для сообщения 1100101</w:t>
+        <w:t>Составлю схему декодирования классического кода Хэмминга для сообщения 1100101</w:t>
       </w:r>
     </w:p>
     <w:p>
@@ -4417,35 +4429,7 @@
           <w:rFonts w:ascii="Times New Roman" w:hAnsi="Times New Roman" w:cs="Times New Roman"/>
           <w:color w:val="000000" w:themeColor="text1"/>
         </w:rPr>
-        <w:t xml:space="preserve">Составлю </w:t>
-      </w:r>
-      <w:r>
-        <w:rPr>
-          <w:rFonts w:ascii="Times New Roman" w:hAnsi="Times New Roman" w:cs="Times New Roman"/>
-          <w:color w:val="000000" w:themeColor="text1"/>
-        </w:rPr>
-        <w:t>схем</w:t>
-      </w:r>
-      <w:r>
-        <w:rPr>
-          <w:rFonts w:ascii="Times New Roman" w:hAnsi="Times New Roman" w:cs="Times New Roman"/>
-          <w:color w:val="000000" w:themeColor="text1"/>
-        </w:rPr>
-        <w:t>у</w:t>
-      </w:r>
-      <w:r>
-        <w:rPr>
-          <w:rFonts w:ascii="Times New Roman" w:hAnsi="Times New Roman" w:cs="Times New Roman"/>
-          <w:color w:val="000000" w:themeColor="text1"/>
-        </w:rPr>
-        <w:t xml:space="preserve"> декодирования классического кода Хэмминга</w:t>
-      </w:r>
-      <w:r>
-        <w:rPr>
-          <w:rFonts w:ascii="Times New Roman" w:hAnsi="Times New Roman" w:cs="Times New Roman"/>
-          <w:color w:val="000000" w:themeColor="text1"/>
-        </w:rPr>
-        <w:t xml:space="preserve"> для сообщения 1</w:t>
+        <w:t>Составлю схему декодирования классического кода Хэмминга для сообщения 1</w:t>
       </w:r>
       <w:r>
         <w:rPr>
@@ -5248,7 +5232,6 @@
         </w:rPr>
         <w:t xml:space="preserve">1), то есть в (1, 1, 0) =&gt; 6 бит, то есть </w:t>
       </w:r>
-      <w:proofErr w:type="spellStart"/>
       <w:r>
         <w:rPr>
           <w:rFonts w:ascii="Times New Roman" w:hAnsi="Times New Roman" w:cs="Times New Roman"/>
@@ -5257,7 +5240,6 @@
         </w:rPr>
         <w:t>i</w:t>
       </w:r>
-      <w:proofErr w:type="spellEnd"/>
       <w:r>
         <w:rPr>
           <w:rFonts w:ascii="Times New Roman" w:hAnsi="Times New Roman" w:cs="Times New Roman"/>
@@ -5340,35 +5322,7 @@
           <w:rFonts w:ascii="Times New Roman" w:hAnsi="Times New Roman" w:cs="Times New Roman"/>
           <w:color w:val="000000" w:themeColor="text1"/>
         </w:rPr>
-        <w:t xml:space="preserve">Составлю </w:t>
-      </w:r>
-      <w:r>
-        <w:rPr>
-          <w:rFonts w:ascii="Times New Roman" w:hAnsi="Times New Roman" w:cs="Times New Roman"/>
-          <w:color w:val="000000" w:themeColor="text1"/>
-        </w:rPr>
-        <w:t>схем</w:t>
-      </w:r>
-      <w:r>
-        <w:rPr>
-          <w:rFonts w:ascii="Times New Roman" w:hAnsi="Times New Roman" w:cs="Times New Roman"/>
-          <w:color w:val="000000" w:themeColor="text1"/>
-        </w:rPr>
-        <w:t>у</w:t>
-      </w:r>
-      <w:r>
-        <w:rPr>
-          <w:rFonts w:ascii="Times New Roman" w:hAnsi="Times New Roman" w:cs="Times New Roman"/>
-          <w:color w:val="000000" w:themeColor="text1"/>
-        </w:rPr>
-        <w:t xml:space="preserve"> декодирования классического кода Хэмминга</w:t>
-      </w:r>
-      <w:r>
-        <w:rPr>
-          <w:rFonts w:ascii="Times New Roman" w:hAnsi="Times New Roman" w:cs="Times New Roman"/>
-          <w:color w:val="000000" w:themeColor="text1"/>
-        </w:rPr>
-        <w:t xml:space="preserve"> для сообщения </w:t>
+        <w:t xml:space="preserve">Составлю схему декодирования классического кода Хэмминга для сообщения </w:t>
       </w:r>
       <w:r>
         <w:rPr>
@@ -7187,7 +7141,6 @@
         </w:rPr>
         <w:t xml:space="preserve">1), то есть в (1, 1, 1, 0) =&gt; 14 бит, то есть </w:t>
       </w:r>
-      <w:proofErr w:type="spellStart"/>
       <w:r>
         <w:rPr>
           <w:rFonts w:ascii="Times New Roman" w:hAnsi="Times New Roman" w:cs="Times New Roman"/>
@@ -7196,7 +7149,6 @@
         </w:rPr>
         <w:t>i</w:t>
       </w:r>
-      <w:proofErr w:type="spellEnd"/>
       <w:r>
         <w:rPr>
           <w:rFonts w:ascii="Times New Roman" w:hAnsi="Times New Roman" w:cs="Times New Roman"/>
@@ -7289,7 +7241,6 @@
         </w:rPr>
         <w:t xml:space="preserve">То есть </w:t>
       </w:r>
-      <w:proofErr w:type="spellStart"/>
       <w:r>
         <w:rPr>
           <w:rFonts w:ascii="Times New Roman" w:hAnsi="Times New Roman" w:cs="Times New Roman"/>
@@ -7298,20 +7249,12 @@
         </w:rPr>
         <w:t>i</w:t>
       </w:r>
-      <w:proofErr w:type="spellEnd"/>
-      <w:r>
-        <w:rPr>
-          <w:rFonts w:ascii="Times New Roman" w:hAnsi="Times New Roman" w:cs="Times New Roman"/>
-          <w:color w:val="000000" w:themeColor="text1"/>
-        </w:rPr>
-        <w:t xml:space="preserve"> = 12</w:t>
-      </w:r>
-      <w:r>
-        <w:rPr>
-          <w:rFonts w:ascii="Times New Roman" w:hAnsi="Times New Roman" w:cs="Times New Roman"/>
-          <w:color w:val="000000" w:themeColor="text1"/>
-        </w:rPr>
-        <w:t>08</w:t>
+      <w:r>
+        <w:rPr>
+          <w:rFonts w:ascii="Times New Roman" w:hAnsi="Times New Roman" w:cs="Times New Roman"/>
+          <w:color w:val="000000" w:themeColor="text1"/>
+        </w:rPr>
+        <w:t xml:space="preserve"> = 1208</w:t>
       </w:r>
     </w:p>
     <w:p>
@@ -7398,7 +7341,7 @@
           <w:color w:val="000000" w:themeColor="text1"/>
           <w:lang w:val="en-US"/>
         </w:rPr>
-        <w:t xml:space="preserve"> </w:t>
+        <w:t xml:space="preserve"> r + </w:t>
       </w:r>
       <w:r>
         <w:rPr>
@@ -7406,26 +7349,8 @@
           <w:color w:val="000000" w:themeColor="text1"/>
           <w:lang w:val="en-US"/>
         </w:rPr>
-        <w:t>r</w:t>
-      </w:r>
-      <w:r>
-        <w:rPr>
-          <w:rFonts w:ascii="Times New Roman" w:hAnsi="Times New Roman" w:cs="Times New Roman"/>
-          <w:color w:val="000000" w:themeColor="text1"/>
-          <w:lang w:val="en-US"/>
-        </w:rPr>
-        <w:t xml:space="preserve"> + </w:t>
-      </w:r>
-      <w:proofErr w:type="spellStart"/>
-      <w:r>
-        <w:rPr>
-          <w:rFonts w:ascii="Times New Roman" w:hAnsi="Times New Roman" w:cs="Times New Roman"/>
-          <w:color w:val="000000" w:themeColor="text1"/>
-          <w:lang w:val="en-US"/>
-        </w:rPr>
         <w:t>i</w:t>
       </w:r>
-      <w:proofErr w:type="spellEnd"/>
       <w:r>
         <w:rPr>
           <w:rFonts w:ascii="Times New Roman" w:hAnsi="Times New Roman" w:cs="Times New Roman"/>
@@ -7482,23 +7407,7 @@
           <w:color w:val="000000" w:themeColor="text1"/>
           <w:lang w:val="en-US"/>
         </w:rPr>
-        <w:t xml:space="preserve"> </w:t>
-      </w:r>
-      <w:r>
-        <w:rPr>
-          <w:rFonts w:ascii="Times New Roman" w:hAnsi="Times New Roman" w:cs="Times New Roman"/>
-          <w:color w:val="000000" w:themeColor="text1"/>
-          <w:lang w:val="en-US"/>
-        </w:rPr>
-        <w:t>r</w:t>
-      </w:r>
-      <w:r>
-        <w:rPr>
-          <w:rFonts w:ascii="Times New Roman" w:hAnsi="Times New Roman" w:cs="Times New Roman"/>
-          <w:color w:val="000000" w:themeColor="text1"/>
-          <w:lang w:val="en-US"/>
-        </w:rPr>
-        <w:t xml:space="preserve"> + 1208 + 1</w:t>
+        <w:t xml:space="preserve"> r + 1208 + 1</w:t>
       </w:r>
     </w:p>
     <w:p>
@@ -7536,14 +7445,7 @@
           <w:rFonts w:ascii="Times New Roman" w:hAnsi="Times New Roman" w:cs="Times New Roman"/>
           <w:color w:val="000000" w:themeColor="text1"/>
         </w:rPr>
-        <w:t xml:space="preserve"> </w:t>
-      </w:r>
-      <w:r>
-        <w:rPr>
-          <w:rFonts w:ascii="Times New Roman" w:hAnsi="Times New Roman" w:cs="Times New Roman"/>
-          <w:color w:val="000000" w:themeColor="text1"/>
-        </w:rPr>
-        <w:t>&lt; 2</w:t>
+        <w:t xml:space="preserve"> &lt; 2</w:t>
       </w:r>
       <w:r>
         <w:rPr>
@@ -7773,6 +7675,7 @@
     <w:p>
       <w:pPr>
         <w:rPr>
+          <w:color w:val="000000" w:themeColor="text1"/>
           <w:lang w:val="en-US"/>
         </w:rPr>
       </w:pPr>
@@ -7790,6 +7693,7 @@
     <w:p>
       <w:pPr>
         <w:rPr>
+          <w:color w:val="000000" w:themeColor="text1"/>
           <w:lang w:val="en-US"/>
         </w:rPr>
       </w:pPr>
@@ -7797,35 +7701,46 @@
     <w:p>
       <w:pPr>
         <w:rPr>
+          <w:color w:val="000000" w:themeColor="text1"/>
           <w:lang w:val="en-US"/>
         </w:rPr>
       </w:pPr>
       <w:r>
+        <w:rPr>
+          <w:color w:val="000000" w:themeColor="text1"/>
+        </w:rPr>
         <w:t xml:space="preserve">Также загрузил решение на </w:t>
       </w:r>
-      <w:proofErr w:type="spellStart"/>
-      <w:r>
-        <w:rPr>
+      <w:r>
+        <w:rPr>
+          <w:color w:val="000000" w:themeColor="text1"/>
           <w:lang w:val="en-US"/>
         </w:rPr>
         <w:t>gitlab</w:t>
       </w:r>
-      <w:proofErr w:type="spellEnd"/>
-      <w:r>
+      <w:r>
+        <w:rPr>
+          <w:color w:val="000000" w:themeColor="text1"/>
+        </w:rPr>
         <w:t xml:space="preserve"> </w:t>
       </w:r>
-      <w:proofErr w:type="spellStart"/>
-      <w:r>
-        <w:rPr>
+      <w:r>
+        <w:rPr>
+          <w:color w:val="000000" w:themeColor="text1"/>
           <w:lang w:val="en-US"/>
         </w:rPr>
         <w:t>itmo</w:t>
       </w:r>
-      <w:proofErr w:type="spellEnd"/>
-      <w:r>
+      <w:r>
+        <w:rPr>
+          <w:color w:val="000000" w:themeColor="text1"/>
+        </w:rPr>
         <w:t xml:space="preserve"> </w:t>
       </w:r>
       <w:r>
+        <w:rPr>
+          <w:color w:val="000000" w:themeColor="text1"/>
+        </w:rPr>
         <w:t xml:space="preserve"> </w:t>
       </w:r>
     </w:p>
@@ -7833,11 +7748,13 @@
       <w:pPr>
         <w:rPr>
           <w:rFonts w:ascii="Times New Roman" w:hAnsi="Times New Roman" w:cs="Times New Roman"/>
-        </w:rPr>
-      </w:pPr>
-      <w:r>
-        <w:rPr>
-          <w:rFonts w:ascii="Times New Roman" w:hAnsi="Times New Roman" w:cs="Times New Roman"/>
+          <w:color w:val="000000" w:themeColor="text1"/>
+        </w:rPr>
+      </w:pPr>
+      <w:r>
+        <w:rPr>
+          <w:rFonts w:ascii="Times New Roman" w:hAnsi="Times New Roman" w:cs="Times New Roman"/>
+          <w:color w:val="000000" w:themeColor="text1"/>
           <w:lang w:val="en-US"/>
         </w:rPr>
         <w:fldChar w:fldCharType="begin"/>
@@ -7845,132 +7762,165 @@
       <w:r>
         <w:rPr>
           <w:rFonts w:ascii="Times New Roman" w:hAnsi="Times New Roman" w:cs="Times New Roman"/>
+          <w:color w:val="000000" w:themeColor="text1"/>
           <w:lang w:val="en-US"/>
         </w:rPr>
-        <w:instrText>HYPERLINK "</w:instrText>
-      </w:r>
-      <w:r>
-        <w:rPr>
-          <w:rFonts w:ascii="Times New Roman" w:hAnsi="Times New Roman" w:cs="Times New Roman"/>
+        <w:instrText>HYPERLINK "https</w:instrText>
+      </w:r>
+      <w:r>
+        <w:rPr>
+          <w:rFonts w:ascii="Times New Roman" w:hAnsi="Times New Roman" w:cs="Times New Roman"/>
+          <w:color w:val="000000" w:themeColor="text1"/>
+        </w:rPr>
+        <w:instrText>://</w:instrText>
+      </w:r>
+      <w:r>
+        <w:rPr>
+          <w:rFonts w:ascii="Times New Roman" w:hAnsi="Times New Roman" w:cs="Times New Roman"/>
+          <w:color w:val="000000" w:themeColor="text1"/>
           <w:lang w:val="en-US"/>
         </w:rPr>
-        <w:instrText>https</w:instrText>
-      </w:r>
-      <w:r>
-        <w:rPr>
-          <w:rFonts w:ascii="Times New Roman" w:hAnsi="Times New Roman" w:cs="Times New Roman"/>
-        </w:rPr>
-        <w:instrText>://</w:instrText>
-      </w:r>
-      <w:r>
-        <w:rPr>
-          <w:rFonts w:ascii="Times New Roman" w:hAnsi="Times New Roman" w:cs="Times New Roman"/>
+        <w:instrText>gitlab</w:instrText>
+      </w:r>
+      <w:r>
+        <w:rPr>
+          <w:rFonts w:ascii="Times New Roman" w:hAnsi="Times New Roman" w:cs="Times New Roman"/>
+          <w:color w:val="000000" w:themeColor="text1"/>
+        </w:rPr>
+        <w:instrText>.</w:instrText>
+      </w:r>
+      <w:r>
+        <w:rPr>
+          <w:rFonts w:ascii="Times New Roman" w:hAnsi="Times New Roman" w:cs="Times New Roman"/>
+          <w:color w:val="000000" w:themeColor="text1"/>
           <w:lang w:val="en-US"/>
         </w:rPr>
-        <w:instrText>gitlab</w:instrText>
-      </w:r>
-      <w:r>
-        <w:rPr>
-          <w:rFonts w:ascii="Times New Roman" w:hAnsi="Times New Roman" w:cs="Times New Roman"/>
+        <w:instrText>se</w:instrText>
+      </w:r>
+      <w:r>
+        <w:rPr>
+          <w:rFonts w:ascii="Times New Roman" w:hAnsi="Times New Roman" w:cs="Times New Roman"/>
+          <w:color w:val="000000" w:themeColor="text1"/>
         </w:rPr>
         <w:instrText>.</w:instrText>
       </w:r>
       <w:r>
         <w:rPr>
           <w:rFonts w:ascii="Times New Roman" w:hAnsi="Times New Roman" w:cs="Times New Roman"/>
+          <w:color w:val="000000" w:themeColor="text1"/>
           <w:lang w:val="en-US"/>
         </w:rPr>
-        <w:instrText>se</w:instrText>
-      </w:r>
-      <w:r>
-        <w:rPr>
-          <w:rFonts w:ascii="Times New Roman" w:hAnsi="Times New Roman" w:cs="Times New Roman"/>
+        <w:instrText>ifmo</w:instrText>
+      </w:r>
+      <w:r>
+        <w:rPr>
+          <w:rFonts w:ascii="Times New Roman" w:hAnsi="Times New Roman" w:cs="Times New Roman"/>
+          <w:color w:val="000000" w:themeColor="text1"/>
         </w:rPr>
         <w:instrText>.</w:instrText>
       </w:r>
       <w:r>
         <w:rPr>
           <w:rFonts w:ascii="Times New Roman" w:hAnsi="Times New Roman" w:cs="Times New Roman"/>
+          <w:color w:val="000000" w:themeColor="text1"/>
           <w:lang w:val="en-US"/>
         </w:rPr>
-        <w:instrText>ifmo</w:instrText>
-      </w:r>
-      <w:r>
-        <w:rPr>
-          <w:rFonts w:ascii="Times New Roman" w:hAnsi="Times New Roman" w:cs="Times New Roman"/>
-        </w:rPr>
-        <w:instrText>.</w:instrText>
-      </w:r>
-      <w:r>
-        <w:rPr>
-          <w:rFonts w:ascii="Times New Roman" w:hAnsi="Times New Roman" w:cs="Times New Roman"/>
+        <w:instrText>ru</w:instrText>
+      </w:r>
+      <w:r>
+        <w:rPr>
+          <w:rFonts w:ascii="Times New Roman" w:hAnsi="Times New Roman" w:cs="Times New Roman"/>
+          <w:color w:val="000000" w:themeColor="text1"/>
+        </w:rPr>
+        <w:instrText>/124476/</w:instrText>
+      </w:r>
+      <w:r>
+        <w:rPr>
+          <w:rFonts w:ascii="Times New Roman" w:hAnsi="Times New Roman" w:cs="Times New Roman"/>
+          <w:color w:val="000000" w:themeColor="text1"/>
           <w:lang w:val="en-US"/>
         </w:rPr>
-        <w:instrText>ru</w:instrText>
-      </w:r>
-      <w:r>
-        <w:rPr>
-          <w:rFonts w:ascii="Times New Roman" w:hAnsi="Times New Roman" w:cs="Times New Roman"/>
-        </w:rPr>
-        <w:instrText>/124476/</w:instrText>
-      </w:r>
-      <w:r>
-        <w:rPr>
-          <w:rFonts w:ascii="Times New Roman" w:hAnsi="Times New Roman" w:cs="Times New Roman"/>
+        <w:instrText>informatics</w:instrText>
+      </w:r>
+    </w:p>
+    <w:p>
+      <w:pPr>
+        <w:rPr>
+          <w:rStyle w:val="ac"/>
+          <w:rFonts w:ascii="Times New Roman" w:hAnsi="Times New Roman" w:cs="Times New Roman"/>
+          <w:color w:val="000000" w:themeColor="text1"/>
+        </w:rPr>
+      </w:pPr>
+      <w:r>
+        <w:rPr>
+          <w:rFonts w:ascii="Times New Roman" w:hAnsi="Times New Roman" w:cs="Times New Roman"/>
+          <w:color w:val="000000" w:themeColor="text1"/>
+        </w:rPr>
+        <w:instrText>"</w:instrText>
+      </w:r>
+      <w:r>
+        <w:rPr>
+          <w:rFonts w:ascii="Times New Roman" w:hAnsi="Times New Roman" w:cs="Times New Roman"/>
+          <w:color w:val="000000" w:themeColor="text1"/>
           <w:lang w:val="en-US"/>
         </w:rPr>
-        <w:instrText>informatics</w:instrText>
-      </w:r>
-    </w:p>
-    <w:p>
-      <w:pPr>
+      </w:r>
+      <w:r>
+        <w:rPr>
+          <w:rFonts w:ascii="Times New Roman" w:hAnsi="Times New Roman" w:cs="Times New Roman"/>
+          <w:color w:val="000000" w:themeColor="text1"/>
+          <w:lang w:val="en-US"/>
+        </w:rPr>
+        <w:fldChar w:fldCharType="separate"/>
+      </w:r>
+      <w:r>
         <w:rPr>
           <w:rStyle w:val="ac"/>
           <w:rFonts w:ascii="Times New Roman" w:hAnsi="Times New Roman" w:cs="Times New Roman"/>
-        </w:rPr>
-      </w:pPr>
-      <w:r>
-        <w:rPr>
-          <w:rFonts w:ascii="Times New Roman" w:hAnsi="Times New Roman" w:cs="Times New Roman"/>
-        </w:rPr>
-        <w:instrText>"</w:instrText>
-      </w:r>
-      <w:r>
-        <w:rPr>
-          <w:rFonts w:ascii="Times New Roman" w:hAnsi="Times New Roman" w:cs="Times New Roman"/>
+          <w:color w:val="000000" w:themeColor="text1"/>
           <w:lang w:val="en-US"/>
         </w:rPr>
-        <w:fldChar w:fldCharType="separate"/>
+        <w:t>https</w:t>
       </w:r>
       <w:r>
         <w:rPr>
           <w:rStyle w:val="ac"/>
           <w:rFonts w:ascii="Times New Roman" w:hAnsi="Times New Roman" w:cs="Times New Roman"/>
+          <w:color w:val="000000" w:themeColor="text1"/>
+        </w:rPr>
+        <w:t>://</w:t>
+      </w:r>
+      <w:r>
+        <w:rPr>
+          <w:rStyle w:val="ac"/>
+          <w:rFonts w:ascii="Times New Roman" w:hAnsi="Times New Roman" w:cs="Times New Roman"/>
+          <w:color w:val="000000" w:themeColor="text1"/>
           <w:lang w:val="en-US"/>
         </w:rPr>
-        <w:t>https</w:t>
+        <w:t>gitlab</w:t>
       </w:r>
       <w:r>
         <w:rPr>
           <w:rStyle w:val="ac"/>
           <w:rFonts w:ascii="Times New Roman" w:hAnsi="Times New Roman" w:cs="Times New Roman"/>
-        </w:rPr>
-        <w:t>://</w:t>
-      </w:r>
-      <w:proofErr w:type="spellStart"/>
+          <w:color w:val="000000" w:themeColor="text1"/>
+        </w:rPr>
+        <w:t>.</w:t>
+      </w:r>
       <w:r>
         <w:rPr>
           <w:rStyle w:val="ac"/>
           <w:rFonts w:ascii="Times New Roman" w:hAnsi="Times New Roman" w:cs="Times New Roman"/>
+          <w:color w:val="000000" w:themeColor="text1"/>
           <w:lang w:val="en-US"/>
         </w:rPr>
-        <w:t>gitlab</w:t>
-      </w:r>
-      <w:proofErr w:type="spellEnd"/>
+        <w:t>se</w:t>
+      </w:r>
       <w:r>
         <w:rPr>
           <w:rStyle w:val="ac"/>
           <w:rFonts w:ascii="Times New Roman" w:hAnsi="Times New Roman" w:cs="Times New Roman"/>
+          <w:color w:val="000000" w:themeColor="text1"/>
         </w:rPr>
         <w:t>.</w:t>
       </w:r>
@@ -7978,83 +7928,65 @@
         <w:rPr>
           <w:rStyle w:val="ac"/>
           <w:rFonts w:ascii="Times New Roman" w:hAnsi="Times New Roman" w:cs="Times New Roman"/>
+          <w:color w:val="000000" w:themeColor="text1"/>
           <w:lang w:val="en-US"/>
         </w:rPr>
-        <w:t>se</w:t>
+        <w:t>ifmo</w:t>
       </w:r>
       <w:r>
         <w:rPr>
           <w:rStyle w:val="ac"/>
           <w:rFonts w:ascii="Times New Roman" w:hAnsi="Times New Roman" w:cs="Times New Roman"/>
+          <w:color w:val="000000" w:themeColor="text1"/>
         </w:rPr>
         <w:t>.</w:t>
       </w:r>
-      <w:proofErr w:type="spellStart"/>
       <w:r>
         <w:rPr>
           <w:rStyle w:val="ac"/>
           <w:rFonts w:ascii="Times New Roman" w:hAnsi="Times New Roman" w:cs="Times New Roman"/>
+          <w:color w:val="000000" w:themeColor="text1"/>
           <w:lang w:val="en-US"/>
         </w:rPr>
-        <w:t>ifmo</w:t>
-      </w:r>
-      <w:proofErr w:type="spellEnd"/>
+        <w:t>ru</w:t>
+      </w:r>
       <w:r>
         <w:rPr>
           <w:rStyle w:val="ac"/>
           <w:rFonts w:ascii="Times New Roman" w:hAnsi="Times New Roman" w:cs="Times New Roman"/>
-        </w:rPr>
-        <w:t>.</w:t>
-      </w:r>
-      <w:proofErr w:type="spellStart"/>
+          <w:color w:val="000000" w:themeColor="text1"/>
+        </w:rPr>
+        <w:t>/124476/</w:t>
+      </w:r>
       <w:r>
         <w:rPr>
           <w:rStyle w:val="ac"/>
           <w:rFonts w:ascii="Times New Roman" w:hAnsi="Times New Roman" w:cs="Times New Roman"/>
+          <w:color w:val="000000" w:themeColor="text1"/>
           <w:lang w:val="en-US"/>
         </w:rPr>
-        <w:t>ru</w:t>
-      </w:r>
-      <w:proofErr w:type="spellEnd"/>
-      <w:r>
-        <w:rPr>
-          <w:rStyle w:val="ac"/>
-          <w:rFonts w:ascii="Times New Roman" w:hAnsi="Times New Roman" w:cs="Times New Roman"/>
-        </w:rPr>
-        <w:t>/12447</w:t>
-      </w:r>
-      <w:r>
-        <w:rPr>
-          <w:rStyle w:val="ac"/>
-          <w:rFonts w:ascii="Times New Roman" w:hAnsi="Times New Roman" w:cs="Times New Roman"/>
-        </w:rPr>
-        <w:t>6</w:t>
-      </w:r>
-      <w:r>
-        <w:rPr>
-          <w:rStyle w:val="ac"/>
-          <w:rFonts w:ascii="Times New Roman" w:hAnsi="Times New Roman" w:cs="Times New Roman"/>
-        </w:rPr>
-        <w:t>/</w:t>
-      </w:r>
-      <w:r>
-        <w:rPr>
-          <w:rStyle w:val="ac"/>
-          <w:rFonts w:ascii="Times New Roman" w:hAnsi="Times New Roman" w:cs="Times New Roman"/>
+        <w:t>informatics</w:t>
+      </w:r>
+    </w:p>
+    <w:p>
+      <w:pPr>
+        <w:rPr>
+          <w:color w:val="000000" w:themeColor="text1"/>
+        </w:rPr>
+      </w:pPr>
+      <w:r>
+        <w:rPr>
+          <w:rFonts w:ascii="Times New Roman" w:hAnsi="Times New Roman" w:cs="Times New Roman"/>
+          <w:color w:val="000000" w:themeColor="text1"/>
           <w:lang w:val="en-US"/>
         </w:rPr>
-        <w:t>informatics</w:t>
-      </w:r>
-    </w:p>
-    <w:p>
-      <w:r>
-        <w:rPr>
-          <w:rFonts w:ascii="Times New Roman" w:hAnsi="Times New Roman" w:cs="Times New Roman"/>
-          <w:lang w:val="en-US"/>
-        </w:rPr>
         <w:fldChar w:fldCharType="end"/>
       </w:r>
       <w:r>
+        <w:rPr>
+          <w:noProof/>
+          <w:color w:val="000000" w:themeColor="text1"/>
+        </w:rPr>
         <w:drawing>
           <wp:inline distT="0" distB="0" distL="0" distR="0" wp14:anchorId="624DE7D8" wp14:editId="618DF825">
             <wp:extent cx="5940425" cy="6744970"/>
@@ -8102,30 +8034,18 @@
         </w:rPr>
       </w:pPr>
       <w:r>
+        <w:rPr>
+          <w:color w:val="000000" w:themeColor="text1"/>
+        </w:rPr>
         <w:t xml:space="preserve">Рисунок 6 – </w:t>
       </w:r>
-      <w:proofErr w:type="spellStart"/>
-      <w:r>
-        <w:rPr>
+      <w:r>
+        <w:rPr>
+          <w:color w:val="000000" w:themeColor="text1"/>
           <w:lang w:val="en-US"/>
         </w:rPr>
-        <w:t>gitlab</w:t>
-      </w:r>
-      <w:proofErr w:type="spellEnd"/>
-      <w:r>
-        <w:rPr>
-          <w:lang w:val="en-US"/>
-        </w:rPr>
-        <w:t xml:space="preserve"> </w:t>
-      </w:r>
-      <w:proofErr w:type="spellStart"/>
-      <w:r>
-        <w:rPr>
-          <w:lang w:val="en-US"/>
-        </w:rPr>
-        <w:t>itmo</w:t>
-      </w:r>
-      <w:proofErr w:type="spellEnd"/>
+        <w:t>gitlab itmo</w:t>
+      </w:r>
     </w:p>
     <w:p>
       <w:pPr>
@@ -8204,7 +8124,6 @@
         </w:rPr>
         <w:t xml:space="preserve">2. Научился загружать решения на </w:t>
       </w:r>
-      <w:proofErr w:type="spellStart"/>
       <w:r>
         <w:rPr>
           <w:rFonts w:ascii="Times New Roman" w:hAnsi="Times New Roman" w:cs="Times New Roman"/>
@@ -8213,23 +8132,13 @@
         </w:rPr>
         <w:t>gitlab</w:t>
       </w:r>
-      <w:proofErr w:type="spellEnd"/>
-      <w:r>
-        <w:rPr>
-          <w:rFonts w:ascii="Times New Roman" w:hAnsi="Times New Roman" w:cs="Times New Roman"/>
-          <w:color w:val="000000" w:themeColor="text1"/>
-        </w:rPr>
-        <w:t xml:space="preserve"> </w:t>
-      </w:r>
-      <w:proofErr w:type="spellStart"/>
-      <w:r>
-        <w:rPr>
-          <w:rFonts w:ascii="Times New Roman" w:hAnsi="Times New Roman" w:cs="Times New Roman"/>
-          <w:color w:val="000000" w:themeColor="text1"/>
-        </w:rPr>
-        <w:t>итмо</w:t>
-      </w:r>
-      <w:proofErr w:type="spellEnd"/>
+      <w:r>
+        <w:rPr>
+          <w:rFonts w:ascii="Times New Roman" w:hAnsi="Times New Roman" w:cs="Times New Roman"/>
+          <w:color w:val="000000" w:themeColor="text1"/>
+        </w:rPr>
+        <w:t xml:space="preserve"> итмо</w:t>
+      </w:r>
     </w:p>
     <w:p>
       <w:pPr>
@@ -8325,6 +8234,7 @@
           <w:rPr>
             <w:rStyle w:val="ac"/>
             <w:rFonts w:ascii="Times New Roman" w:hAnsi="Times New Roman" w:cs="Times New Roman"/>
+            <w:color w:val="000000" w:themeColor="text1"/>
           </w:rPr>
           <w:t>http://inf.e-alekseev.ru/text/toc.html</w:t>
         </w:r>
@@ -8334,14 +8244,7 @@
           <w:rFonts w:ascii="Times New Roman" w:hAnsi="Times New Roman" w:cs="Times New Roman"/>
           <w:color w:val="000000" w:themeColor="text1"/>
         </w:rPr>
-        <w:t xml:space="preserve"> </w:t>
-      </w:r>
-      <w:r>
-        <w:rPr>
-          <w:rFonts w:ascii="Times New Roman" w:hAnsi="Times New Roman" w:cs="Times New Roman"/>
-          <w:color w:val="000000" w:themeColor="text1"/>
-        </w:rPr>
-        <w:t>(дата обращения: 26.09.2026)</w:t>
+        <w:t xml:space="preserve"> (дата обращения: 26.09.2026)</w:t>
       </w:r>
     </w:p>
     <w:p>
@@ -8441,6 +8344,7 @@
           <w:rPr>
             <w:rStyle w:val="ac"/>
             <w:rFonts w:ascii="Times New Roman" w:hAnsi="Times New Roman" w:cs="Times New Roman"/>
+            <w:color w:val="000000" w:themeColor="text1"/>
             <w:lang w:val="en-US"/>
           </w:rPr>
           <w:t>https</w:t>
@@ -8449,23 +8353,24 @@
           <w:rPr>
             <w:rStyle w:val="ac"/>
             <w:rFonts w:ascii="Times New Roman" w:hAnsi="Times New Roman" w:cs="Times New Roman"/>
+            <w:color w:val="000000" w:themeColor="text1"/>
           </w:rPr>
           <w:t>://</w:t>
         </w:r>
-        <w:proofErr w:type="spellStart"/>
         <w:r>
           <w:rPr>
             <w:rStyle w:val="ac"/>
             <w:rFonts w:ascii="Times New Roman" w:hAnsi="Times New Roman" w:cs="Times New Roman"/>
+            <w:color w:val="000000" w:themeColor="text1"/>
             <w:lang w:val="en-US"/>
           </w:rPr>
           <w:t>worrydream</w:t>
         </w:r>
-        <w:proofErr w:type="spellEnd"/>
         <w:r>
           <w:rPr>
             <w:rStyle w:val="ac"/>
             <w:rFonts w:ascii="Times New Roman" w:hAnsi="Times New Roman" w:cs="Times New Roman"/>
+            <w:color w:val="000000" w:themeColor="text1"/>
           </w:rPr>
           <w:t>.</w:t>
         </w:r>
@@ -8473,6 +8378,7 @@
           <w:rPr>
             <w:rStyle w:val="ac"/>
             <w:rFonts w:ascii="Times New Roman" w:hAnsi="Times New Roman" w:cs="Times New Roman"/>
+            <w:color w:val="000000" w:themeColor="text1"/>
             <w:lang w:val="en-US"/>
           </w:rPr>
           <w:t>com</w:t>
@@ -8481,6 +8387,7 @@
           <w:rPr>
             <w:rStyle w:val="ac"/>
             <w:rFonts w:ascii="Times New Roman" w:hAnsi="Times New Roman" w:cs="Times New Roman"/>
+            <w:color w:val="000000" w:themeColor="text1"/>
           </w:rPr>
           <w:t>/</w:t>
         </w:r>
@@ -8488,6 +8395,7 @@
           <w:rPr>
             <w:rStyle w:val="ac"/>
             <w:rFonts w:ascii="Times New Roman" w:hAnsi="Times New Roman" w:cs="Times New Roman"/>
+            <w:color w:val="000000" w:themeColor="text1"/>
             <w:lang w:val="en-US"/>
           </w:rPr>
           <w:t>refs</w:t>
@@ -8496,6 +8404,7 @@
           <w:rPr>
             <w:rStyle w:val="ac"/>
             <w:rFonts w:ascii="Times New Roman" w:hAnsi="Times New Roman" w:cs="Times New Roman"/>
+            <w:color w:val="000000" w:themeColor="text1"/>
           </w:rPr>
           <w:t>/</w:t>
         </w:r>
@@ -8503,6 +8412,7 @@
           <w:rPr>
             <w:rStyle w:val="ac"/>
             <w:rFonts w:ascii="Times New Roman" w:hAnsi="Times New Roman" w:cs="Times New Roman"/>
+            <w:color w:val="000000" w:themeColor="text1"/>
             <w:lang w:val="en-US"/>
           </w:rPr>
           <w:t>Hamming</w:t>
@@ -8511,6 +8421,7 @@
           <w:rPr>
             <w:rStyle w:val="ac"/>
             <w:rFonts w:ascii="Times New Roman" w:hAnsi="Times New Roman" w:cs="Times New Roman"/>
+            <w:color w:val="000000" w:themeColor="text1"/>
           </w:rPr>
           <w:t>_1997_-_</w:t>
         </w:r>
@@ -8518,6 +8429,7 @@
           <w:rPr>
             <w:rStyle w:val="ac"/>
             <w:rFonts w:ascii="Times New Roman" w:hAnsi="Times New Roman" w:cs="Times New Roman"/>
+            <w:color w:val="000000" w:themeColor="text1"/>
             <w:lang w:val="en-US"/>
           </w:rPr>
           <w:t>The</w:t>
@@ -8526,6 +8438,7 @@
           <w:rPr>
             <w:rStyle w:val="ac"/>
             <w:rFonts w:ascii="Times New Roman" w:hAnsi="Times New Roman" w:cs="Times New Roman"/>
+            <w:color w:val="000000" w:themeColor="text1"/>
           </w:rPr>
           <w:t>_</w:t>
         </w:r>
@@ -8533,6 +8446,7 @@
           <w:rPr>
             <w:rStyle w:val="ac"/>
             <w:rFonts w:ascii="Times New Roman" w:hAnsi="Times New Roman" w:cs="Times New Roman"/>
+            <w:color w:val="000000" w:themeColor="text1"/>
             <w:lang w:val="en-US"/>
           </w:rPr>
           <w:t>Art</w:t>
@@ -8541,6 +8455,7 @@
           <w:rPr>
             <w:rStyle w:val="ac"/>
             <w:rFonts w:ascii="Times New Roman" w:hAnsi="Times New Roman" w:cs="Times New Roman"/>
+            <w:color w:val="000000" w:themeColor="text1"/>
           </w:rPr>
           <w:t>_</w:t>
         </w:r>
@@ -8548,6 +8463,7 @@
           <w:rPr>
             <w:rStyle w:val="ac"/>
             <w:rFonts w:ascii="Times New Roman" w:hAnsi="Times New Roman" w:cs="Times New Roman"/>
+            <w:color w:val="000000" w:themeColor="text1"/>
             <w:lang w:val="en-US"/>
           </w:rPr>
           <w:t>of</w:t>
@@ -8556,6 +8472,7 @@
           <w:rPr>
             <w:rStyle w:val="ac"/>
             <w:rFonts w:ascii="Times New Roman" w:hAnsi="Times New Roman" w:cs="Times New Roman"/>
+            <w:color w:val="000000" w:themeColor="text1"/>
           </w:rPr>
           <w:t>_</w:t>
         </w:r>
@@ -8563,6 +8480,7 @@
           <w:rPr>
             <w:rStyle w:val="ac"/>
             <w:rFonts w:ascii="Times New Roman" w:hAnsi="Times New Roman" w:cs="Times New Roman"/>
+            <w:color w:val="000000" w:themeColor="text1"/>
             <w:lang w:val="en-US"/>
           </w:rPr>
           <w:t>Doing</w:t>
@@ -8571,6 +8489,7 @@
           <w:rPr>
             <w:rStyle w:val="ac"/>
             <w:rFonts w:ascii="Times New Roman" w:hAnsi="Times New Roman" w:cs="Times New Roman"/>
+            <w:color w:val="000000" w:themeColor="text1"/>
           </w:rPr>
           <w:t>_</w:t>
         </w:r>
@@ -8578,6 +8497,7 @@
           <w:rPr>
             <w:rStyle w:val="ac"/>
             <w:rFonts w:ascii="Times New Roman" w:hAnsi="Times New Roman" w:cs="Times New Roman"/>
+            <w:color w:val="000000" w:themeColor="text1"/>
             <w:lang w:val="en-US"/>
           </w:rPr>
           <w:t>Science</w:t>
@@ -8586,6 +8506,7 @@
           <w:rPr>
             <w:rStyle w:val="ac"/>
             <w:rFonts w:ascii="Times New Roman" w:hAnsi="Times New Roman" w:cs="Times New Roman"/>
+            <w:color w:val="000000" w:themeColor="text1"/>
           </w:rPr>
           <w:t>_</w:t>
         </w:r>
@@ -8593,6 +8514,7 @@
           <w:rPr>
             <w:rStyle w:val="ac"/>
             <w:rFonts w:ascii="Times New Roman" w:hAnsi="Times New Roman" w:cs="Times New Roman"/>
+            <w:color w:val="000000" w:themeColor="text1"/>
             <w:lang w:val="en-US"/>
           </w:rPr>
           <w:t>and</w:t>
@@ -8601,6 +8523,7 @@
           <w:rPr>
             <w:rStyle w:val="ac"/>
             <w:rFonts w:ascii="Times New Roman" w:hAnsi="Times New Roman" w:cs="Times New Roman"/>
+            <w:color w:val="000000" w:themeColor="text1"/>
           </w:rPr>
           <w:t>_</w:t>
         </w:r>
@@ -8608,6 +8531,7 @@
           <w:rPr>
             <w:rStyle w:val="ac"/>
             <w:rFonts w:ascii="Times New Roman" w:hAnsi="Times New Roman" w:cs="Times New Roman"/>
+            <w:color w:val="000000" w:themeColor="text1"/>
             <w:lang w:val="en-US"/>
           </w:rPr>
           <w:t>Engineering</w:t>
@@ -8616,6 +8540,7 @@
           <w:rPr>
             <w:rStyle w:val="ac"/>
             <w:rFonts w:ascii="Times New Roman" w:hAnsi="Times New Roman" w:cs="Times New Roman"/>
+            <w:color w:val="000000" w:themeColor="text1"/>
           </w:rPr>
           <w:t>.</w:t>
         </w:r>
@@ -8623,6 +8548,7 @@
           <w:rPr>
             <w:rStyle w:val="ac"/>
             <w:rFonts w:ascii="Times New Roman" w:hAnsi="Times New Roman" w:cs="Times New Roman"/>
+            <w:color w:val="000000" w:themeColor="text1"/>
             <w:lang w:val="en-US"/>
           </w:rPr>
           <w:t>pdf</w:t>
@@ -9754,6 +9680,7 @@
   <w:style w:type="character" w:default="1" w:styleId="a0">
     <w:name w:val="Default Paragraph Font"/>
     <w:uiPriority w:val="1"/>
+    <w:semiHidden/>
     <w:unhideWhenUsed/>
   </w:style>
   <w:style w:type="table" w:default="1" w:styleId="a1">

</xml_diff>